<commit_message>
Increase extra grid padding in contour parameters for improved visualization in mol_shap_draw.py
</commit_message>
<xml_diff>
--- a/Study_plan_with_examples.docx
+++ b/Study_plan_with_examples.docx
@@ -97,13 +97,7 @@
         <w:rPr>
           <w:lang w:val="en-GB"/>
         </w:rPr>
-        <w:t>70/30</w:t>
-      </w:r>
-      <w:r>
-        <w:rPr>
-          <w:lang w:val="en-GB"/>
-        </w:rPr>
-        <w:t xml:space="preserve"> </w:t>
+        <w:t xml:space="preserve">70/30 </w:t>
       </w:r>
       <w:r>
         <w:rPr>
@@ -130,21 +124,7 @@
         <w:rPr>
           <w:lang w:val="en-GB"/>
         </w:rPr>
-        <w:t xml:space="preserve">: Generate molecular fingerprints using ECFP4 (Morgan fingerprints, radius=2, </w:t>
-      </w:r>
-      <w:proofErr w:type="spellStart"/>
-      <w:r>
-        <w:rPr>
-          <w:lang w:val="en-GB"/>
-        </w:rPr>
-        <w:t>nBits</w:t>
-      </w:r>
-      <w:proofErr w:type="spellEnd"/>
-      <w:r>
-        <w:rPr>
-          <w:lang w:val="en-GB"/>
-        </w:rPr>
-        <w:t>=2048) from the SMILES column.</w:t>
+        <w:t>: Generate molecular fingerprints using ECFP4 (Morgan fingerprints, radius=2, nBits=2048) from the SMILES column.</w:t>
       </w:r>
     </w:p>
     <w:p>
@@ -184,31 +164,7 @@
         <w:t xml:space="preserve">: Evaluate the final model (retrained with best hyperparameters on the full training set) on the held-out test set. </w:t>
       </w:r>
       <w:r>
-        <w:t xml:space="preserve">Report </w:t>
-      </w:r>
-      <w:proofErr w:type="spellStart"/>
-      <w:r>
-        <w:t>the</w:t>
-      </w:r>
-      <w:proofErr w:type="spellEnd"/>
-      <w:r>
-        <w:t xml:space="preserve"> </w:t>
-      </w:r>
-      <w:proofErr w:type="spellStart"/>
-      <w:r>
-        <w:t>following</w:t>
-      </w:r>
-      <w:proofErr w:type="spellEnd"/>
-      <w:r>
-        <w:t xml:space="preserve"> </w:t>
-      </w:r>
-      <w:proofErr w:type="spellStart"/>
-      <w:r>
-        <w:t>metrics</w:t>
-      </w:r>
-      <w:proofErr w:type="spellEnd"/>
-      <w:r>
-        <w:t xml:space="preserve">: </w:t>
+        <w:t xml:space="preserve">Report the following metrics: </w:t>
       </w:r>
     </w:p>
     <w:p>
@@ -218,19 +174,9 @@
           <w:numId w:val="1"/>
         </w:numPr>
       </w:pPr>
-      <w:proofErr w:type="spellStart"/>
-      <w:r>
-        <w:t>Balanced</w:t>
-      </w:r>
-      <w:proofErr w:type="spellEnd"/>
-      <w:r>
-        <w:t xml:space="preserve"> </w:t>
-      </w:r>
-      <w:proofErr w:type="spellStart"/>
-      <w:r>
-        <w:t>Accuracy</w:t>
-      </w:r>
-      <w:proofErr w:type="spellEnd"/>
+      <w:r>
+        <w:t>Balanced Accuracy</w:t>
+      </w:r>
     </w:p>
     <w:p>
       <w:pPr>
@@ -273,23 +219,7 @@
         </w:numPr>
       </w:pPr>
       <w:r>
-        <w:t xml:space="preserve">Matthews </w:t>
-      </w:r>
-      <w:proofErr w:type="spellStart"/>
-      <w:r>
-        <w:t>Correlation</w:t>
-      </w:r>
-      <w:proofErr w:type="spellEnd"/>
-      <w:r>
-        <w:t xml:space="preserve"> </w:t>
-      </w:r>
-      <w:proofErr w:type="spellStart"/>
-      <w:r>
-        <w:t>Coefficient</w:t>
-      </w:r>
-      <w:proofErr w:type="spellEnd"/>
-      <w:r>
-        <w:t xml:space="preserve"> (MCC)</w:t>
+        <w:t>Matthews Correlation Coefficient (MCC)</w:t>
       </w:r>
     </w:p>
     <w:p>
@@ -416,17 +346,8 @@
           <w:b/>
           <w:bCs/>
         </w:rPr>
-        <w:t xml:space="preserve">1. Dataset Summary </w:t>
-      </w:r>
-      <w:proofErr w:type="spellStart"/>
-      <w:r>
-        <w:rPr>
-          <w:b/>
-          <w:bCs/>
-        </w:rPr>
-        <w:t>Statistics</w:t>
-      </w:r>
-      <w:proofErr w:type="spellEnd"/>
+        <w:t>1. Dataset Summary Statistics</w:t>
+      </w:r>
     </w:p>
     <w:tbl>
       <w:tblPr>
@@ -481,7 +402,6 @@
                 <w:bCs/>
               </w:rPr>
             </w:pPr>
-            <w:proofErr w:type="spellStart"/>
             <w:r>
               <w:rPr>
                 <w:b/>
@@ -489,7 +409,6 @@
               </w:rPr>
               <w:t>Metric</w:t>
             </w:r>
-            <w:proofErr w:type="spellEnd"/>
           </w:p>
         </w:tc>
         <w:tc>
@@ -670,17 +589,8 @@
                 <w:b/>
                 <w:bCs/>
               </w:rPr>
-              <w:t xml:space="preserve">2,048 </w:t>
-            </w:r>
-            <w:proofErr w:type="spellStart"/>
-            <w:r>
-              <w:rPr>
-                <w:b/>
-                <w:bCs/>
-              </w:rPr>
-              <w:t>bits</w:t>
-            </w:r>
-            <w:proofErr w:type="spellEnd"/>
+              <w:t>2,048 bits</w:t>
+            </w:r>
           </w:p>
         </w:tc>
       </w:tr>
@@ -718,17 +628,8 @@
                 <w:b/>
                 <w:bCs/>
               </w:rPr>
-              <w:t xml:space="preserve">Label </w:t>
-            </w:r>
-            <w:proofErr w:type="spellStart"/>
-            <w:r>
-              <w:rPr>
-                <w:b/>
-                <w:bCs/>
-              </w:rPr>
-              <w:t>Column</w:t>
-            </w:r>
-            <w:proofErr w:type="spellEnd"/>
+              <w:t>Label Column</w:t>
+            </w:r>
           </w:p>
         </w:tc>
         <w:tc>
@@ -756,7 +657,6 @@
                 <w:bCs/>
               </w:rPr>
             </w:pPr>
-            <w:proofErr w:type="spellStart"/>
             <w:r>
               <w:rPr>
                 <w:b/>
@@ -764,7 +664,6 @@
               </w:rPr>
               <w:t>class_label</w:t>
             </w:r>
-            <w:proofErr w:type="spellEnd"/>
           </w:p>
         </w:tc>
       </w:tr>
@@ -797,21 +696,12 @@
                 <w:bCs/>
               </w:rPr>
             </w:pPr>
-            <w:proofErr w:type="spellStart"/>
-            <w:r>
-              <w:rPr>
-                <w:b/>
-                <w:bCs/>
-              </w:rPr>
-              <w:t>Missing</w:t>
-            </w:r>
-            <w:proofErr w:type="spellEnd"/>
-            <w:r>
-              <w:rPr>
-                <w:b/>
-                <w:bCs/>
-              </w:rPr>
-              <w:t xml:space="preserve"> Values</w:t>
+            <w:r>
+              <w:rPr>
+                <w:b/>
+                <w:bCs/>
+              </w:rPr>
+              <w:t>Missing Values</w:t>
             </w:r>
           </w:p>
         </w:tc>
@@ -858,6 +748,7 @@
         <w:rPr>
           <w:b/>
           <w:bCs/>
+          <w:lang w:val="en-GB"/>
         </w:rPr>
       </w:pPr>
     </w:p>
@@ -892,23 +783,7 @@
           <w:b/>
           <w:bCs/>
         </w:rPr>
-        <w:t xml:space="preserve">Class 0: ~675 </w:t>
-      </w:r>
-      <w:proofErr w:type="spellStart"/>
-      <w:r>
-        <w:rPr>
-          <w:b/>
-          <w:bCs/>
-        </w:rPr>
-        <w:t>samples</w:t>
-      </w:r>
-      <w:proofErr w:type="spellEnd"/>
-      <w:r>
-        <w:rPr>
-          <w:b/>
-          <w:bCs/>
-        </w:rPr>
-        <w:t xml:space="preserve"> (~53%)</w:t>
+        <w:t>Class 0: ~675 samples (~53%)</w:t>
       </w:r>
     </w:p>
     <w:p>
@@ -927,23 +802,7 @@
           <w:b/>
           <w:bCs/>
         </w:rPr>
-        <w:t xml:space="preserve">Class 1: ~185 </w:t>
-      </w:r>
-      <w:proofErr w:type="spellStart"/>
-      <w:r>
-        <w:rPr>
-          <w:b/>
-          <w:bCs/>
-        </w:rPr>
-        <w:t>samples</w:t>
-      </w:r>
-      <w:proofErr w:type="spellEnd"/>
-      <w:r>
-        <w:rPr>
-          <w:b/>
-          <w:bCs/>
-        </w:rPr>
-        <w:t xml:space="preserve"> (~14.5%)</w:t>
+        <w:t>Class 1: ~185 samples (~14.5%)</w:t>
       </w:r>
     </w:p>
     <w:p>
@@ -962,23 +821,7 @@
           <w:b/>
           <w:bCs/>
         </w:rPr>
-        <w:t xml:space="preserve">Class 2: ~33 </w:t>
-      </w:r>
-      <w:proofErr w:type="spellStart"/>
-      <w:r>
-        <w:rPr>
-          <w:b/>
-          <w:bCs/>
-        </w:rPr>
-        <w:t>samples</w:t>
-      </w:r>
-      <w:proofErr w:type="spellEnd"/>
-      <w:r>
-        <w:rPr>
-          <w:b/>
-          <w:bCs/>
-        </w:rPr>
-        <w:t xml:space="preserve"> (~2.6%)</w:t>
+        <w:t>Class 2: ~33 samples (~2.6%)</w:t>
       </w:r>
     </w:p>
     <w:p>
@@ -1265,7 +1108,6 @@
                 <w:bCs/>
               </w:rPr>
             </w:pPr>
-            <w:proofErr w:type="spellStart"/>
             <w:r>
               <w:rPr>
                 <w:b/>
@@ -1273,7 +1115,6 @@
               </w:rPr>
               <w:t>Percentage</w:t>
             </w:r>
-            <w:proofErr w:type="spellEnd"/>
           </w:p>
         </w:tc>
       </w:tr>
@@ -1619,17 +1460,8 @@
           <w:b/>
           <w:bCs/>
         </w:rPr>
-        <w:t xml:space="preserve">4. Feature </w:t>
-      </w:r>
-      <w:proofErr w:type="spellStart"/>
-      <w:r>
-        <w:rPr>
-          <w:b/>
-          <w:bCs/>
-        </w:rPr>
-        <w:t>Computation</w:t>
-      </w:r>
-      <w:proofErr w:type="spellEnd"/>
+        <w:t>4. Feature Computation</w:t>
+      </w:r>
     </w:p>
     <w:p>
       <w:pPr>
@@ -1647,23 +1479,7 @@
           <w:b/>
           <w:bCs/>
         </w:rPr>
-        <w:t xml:space="preserve">Method: ECFP (Morgan </w:t>
-      </w:r>
-      <w:proofErr w:type="spellStart"/>
-      <w:r>
-        <w:rPr>
-          <w:b/>
-          <w:bCs/>
-        </w:rPr>
-        <w:t>fingerprints</w:t>
-      </w:r>
-      <w:proofErr w:type="spellEnd"/>
-      <w:r>
-        <w:rPr>
-          <w:b/>
-          <w:bCs/>
-        </w:rPr>
-        <w:t>)</w:t>
+        <w:t>Method: ECFP (Morgan fingerprints)</w:t>
       </w:r>
     </w:p>
     <w:p>
@@ -1701,17 +1517,8 @@
           <w:b/>
           <w:bCs/>
         </w:rPr>
-        <w:t xml:space="preserve">Bit Vector Size: 2,048 </w:t>
-      </w:r>
-      <w:proofErr w:type="spellStart"/>
-      <w:r>
-        <w:rPr>
-          <w:b/>
-          <w:bCs/>
-        </w:rPr>
-        <w:t>bits</w:t>
-      </w:r>
-      <w:proofErr w:type="spellEnd"/>
+        <w:t>Bit Vector Size: 2,048 bits</w:t>
+      </w:r>
     </w:p>
     <w:p>
       <w:pPr>
@@ -1910,7 +1717,6 @@
                 <w:bCs/>
               </w:rPr>
             </w:pPr>
-            <w:proofErr w:type="spellStart"/>
             <w:r>
               <w:rPr>
                 <w:b/>
@@ -1918,7 +1724,6 @@
               </w:rPr>
               <w:t>n_estimators</w:t>
             </w:r>
-            <w:proofErr w:type="spellEnd"/>
           </w:p>
         </w:tc>
         <w:tc>
@@ -1982,7 +1787,6 @@
                 <w:bCs/>
               </w:rPr>
             </w:pPr>
-            <w:proofErr w:type="spellStart"/>
             <w:r>
               <w:rPr>
                 <w:b/>
@@ -1990,7 +1794,6 @@
               </w:rPr>
               <w:t>max_features</w:t>
             </w:r>
-            <w:proofErr w:type="spellEnd"/>
           </w:p>
         </w:tc>
         <w:tc>
@@ -2023,23 +1826,7 @@
                 <w:b/>
                 <w:bCs/>
               </w:rPr>
-              <w:t>"</w:t>
-            </w:r>
-            <w:proofErr w:type="spellStart"/>
-            <w:r>
-              <w:rPr>
-                <w:b/>
-                <w:bCs/>
-              </w:rPr>
-              <w:t>sqrt</w:t>
-            </w:r>
-            <w:proofErr w:type="spellEnd"/>
-            <w:r>
-              <w:rPr>
-                <w:b/>
-                <w:bCs/>
-              </w:rPr>
-              <w:t>"</w:t>
+              <w:t>"sqrt"</w:t>
             </w:r>
           </w:p>
         </w:tc>
@@ -2070,7 +1857,6 @@
                 <w:bCs/>
               </w:rPr>
             </w:pPr>
-            <w:proofErr w:type="spellStart"/>
             <w:r>
               <w:rPr>
                 <w:b/>
@@ -2078,7 +1864,6 @@
               </w:rPr>
               <w:t>min_samples_split</w:t>
             </w:r>
-            <w:proofErr w:type="spellEnd"/>
           </w:p>
         </w:tc>
         <w:tc>
@@ -2142,7 +1927,6 @@
                 <w:bCs/>
               </w:rPr>
             </w:pPr>
-            <w:proofErr w:type="spellStart"/>
             <w:r>
               <w:rPr>
                 <w:b/>
@@ -2150,7 +1934,6 @@
               </w:rPr>
               <w:t>min_samples_leaf</w:t>
             </w:r>
-            <w:proofErr w:type="spellEnd"/>
           </w:p>
         </w:tc>
         <w:tc>
@@ -2227,23 +2010,7 @@
           <w:b/>
           <w:bCs/>
         </w:rPr>
-        <w:t xml:space="preserve">Hyperparameters </w:t>
-      </w:r>
-      <w:proofErr w:type="spellStart"/>
-      <w:r>
-        <w:rPr>
-          <w:b/>
-          <w:bCs/>
-        </w:rPr>
-        <w:t>Searched</w:t>
-      </w:r>
-      <w:proofErr w:type="spellEnd"/>
-      <w:r>
-        <w:rPr>
-          <w:b/>
-          <w:bCs/>
-        </w:rPr>
-        <w:t>:</w:t>
+        <w:t>Hyperparameters Searched:</w:t>
       </w:r>
     </w:p>
     <w:p>
@@ -2257,21 +2024,12 @@
           <w:bCs/>
         </w:rPr>
       </w:pPr>
-      <w:proofErr w:type="spellStart"/>
-      <w:r>
-        <w:rPr>
-          <w:b/>
-          <w:bCs/>
-        </w:rPr>
-        <w:t>n_estimators</w:t>
-      </w:r>
-      <w:proofErr w:type="spellEnd"/>
-      <w:r>
-        <w:rPr>
-          <w:b/>
-          <w:bCs/>
-        </w:rPr>
-        <w:t>: [50, 100, 200]</w:t>
+      <w:r>
+        <w:rPr>
+          <w:b/>
+          <w:bCs/>
+        </w:rPr>
+        <w:t>n_estimators: [50, 100, 200]</w:t>
       </w:r>
     </w:p>
     <w:p>
@@ -2285,37 +2043,12 @@
           <w:bCs/>
         </w:rPr>
       </w:pPr>
-      <w:proofErr w:type="spellStart"/>
-      <w:r>
-        <w:rPr>
-          <w:b/>
-          <w:bCs/>
-        </w:rPr>
-        <w:t>max_features</w:t>
-      </w:r>
-      <w:proofErr w:type="spellEnd"/>
-      <w:r>
-        <w:rPr>
-          <w:b/>
-          <w:bCs/>
-        </w:rPr>
-        <w:t>: ["</w:t>
-      </w:r>
-      <w:proofErr w:type="spellStart"/>
-      <w:r>
-        <w:rPr>
-          <w:b/>
-          <w:bCs/>
-        </w:rPr>
-        <w:t>sqrt</w:t>
-      </w:r>
-      <w:proofErr w:type="spellEnd"/>
-      <w:r>
-        <w:rPr>
-          <w:b/>
-          <w:bCs/>
-        </w:rPr>
-        <w:t>", "log2"]</w:t>
+      <w:r>
+        <w:rPr>
+          <w:b/>
+          <w:bCs/>
+        </w:rPr>
+        <w:t>max_features: ["sqrt", "log2"]</w:t>
       </w:r>
     </w:p>
     <w:p>
@@ -2329,22 +2062,13 @@
           <w:bCs/>
         </w:rPr>
       </w:pPr>
-      <w:proofErr w:type="spellStart"/>
       <w:r>
         <w:rPr>
           <w:b/>
           <w:bCs/>
         </w:rPr>
         <w:lastRenderedPageBreak/>
-        <w:t>min_samples_split</w:t>
-      </w:r>
-      <w:proofErr w:type="spellEnd"/>
-      <w:r>
-        <w:rPr>
-          <w:b/>
-          <w:bCs/>
-        </w:rPr>
-        <w:t>: [2, 5, 10]</w:t>
+        <w:t>min_samples_split: [2, 5, 10]</w:t>
       </w:r>
     </w:p>
     <w:p>
@@ -2358,46 +2082,28 @@
           <w:bCs/>
         </w:rPr>
       </w:pPr>
-      <w:proofErr w:type="spellStart"/>
-      <w:r>
-        <w:rPr>
-          <w:b/>
-          <w:bCs/>
-        </w:rPr>
-        <w:t>min_samples_leaf</w:t>
-      </w:r>
-      <w:proofErr w:type="spellEnd"/>
-      <w:r>
-        <w:rPr>
-          <w:b/>
-          <w:bCs/>
-        </w:rPr>
-        <w:t>: [1, 2, 4]</w:t>
-      </w:r>
-    </w:p>
-    <w:p>
-      <w:pPr>
-        <w:rPr>
-          <w:b/>
-          <w:bCs/>
-        </w:rPr>
-      </w:pPr>
-      <w:r>
-        <w:rPr>
-          <w:b/>
-          <w:bCs/>
-        </w:rPr>
-        <w:t xml:space="preserve">6. Test Set Evaluation </w:t>
-      </w:r>
-      <w:proofErr w:type="spellStart"/>
-      <w:r>
-        <w:rPr>
-          <w:b/>
-          <w:bCs/>
-        </w:rPr>
-        <w:t>Metrics</w:t>
-      </w:r>
-      <w:proofErr w:type="spellEnd"/>
+      <w:r>
+        <w:rPr>
+          <w:b/>
+          <w:bCs/>
+        </w:rPr>
+        <w:t>min_samples_leaf: [1, 2, 4]</w:t>
+      </w:r>
+    </w:p>
+    <w:p>
+      <w:pPr>
+        <w:rPr>
+          <w:b/>
+          <w:bCs/>
+        </w:rPr>
+      </w:pPr>
+      <w:r>
+        <w:rPr>
+          <w:b/>
+          <w:bCs/>
+        </w:rPr>
+        <w:t>6. Test Set Evaluation Metrics</w:t>
+      </w:r>
     </w:p>
     <w:tbl>
       <w:tblPr>
@@ -2451,7 +2157,6 @@
                 <w:bCs/>
               </w:rPr>
             </w:pPr>
-            <w:proofErr w:type="spellStart"/>
             <w:r>
               <w:rPr>
                 <w:b/>
@@ -2459,7 +2164,6 @@
               </w:rPr>
               <w:t>Metric</w:t>
             </w:r>
-            <w:proofErr w:type="spellEnd"/>
           </w:p>
         </w:tc>
         <w:tc>
@@ -2525,37 +2229,12 @@
                 <w:bCs/>
               </w:rPr>
             </w:pPr>
-            <w:proofErr w:type="spellStart"/>
-            <w:r>
-              <w:rPr>
-                <w:b/>
-                <w:bCs/>
-              </w:rPr>
-              <w:t>Balanced</w:t>
-            </w:r>
-            <w:proofErr w:type="spellEnd"/>
-            <w:r>
-              <w:rPr>
-                <w:b/>
-                <w:bCs/>
-              </w:rPr>
-              <w:t xml:space="preserve"> </w:t>
-            </w:r>
-            <w:proofErr w:type="spellStart"/>
-            <w:r>
-              <w:rPr>
-                <w:b/>
-                <w:bCs/>
-              </w:rPr>
-              <w:t>Accuracy</w:t>
-            </w:r>
-            <w:proofErr w:type="spellEnd"/>
-            <w:r>
-              <w:rPr>
-                <w:b/>
-                <w:bCs/>
-              </w:rPr>
-              <w:t xml:space="preserve"> (BA)</w:t>
+            <w:r>
+              <w:rPr>
+                <w:b/>
+                <w:bCs/>
+              </w:rPr>
+              <w:t>Balanced Accuracy (BA)</w:t>
             </w:r>
           </w:p>
         </w:tc>
@@ -2620,7 +2299,6 @@
                 <w:bCs/>
               </w:rPr>
             </w:pPr>
-            <w:proofErr w:type="spellStart"/>
             <w:r>
               <w:rPr>
                 <w:b/>
@@ -2628,7 +2306,6 @@
               </w:rPr>
               <w:t>Accuracy</w:t>
             </w:r>
-            <w:proofErr w:type="spellEnd"/>
           </w:p>
         </w:tc>
         <w:tc>
@@ -2767,17 +2444,8 @@
                 <w:b/>
                 <w:bCs/>
               </w:rPr>
-              <w:t xml:space="preserve">F1 </w:t>
-            </w:r>
-            <w:proofErr w:type="spellStart"/>
-            <w:r>
-              <w:rPr>
-                <w:b/>
-                <w:bCs/>
-              </w:rPr>
-              <w:t>Macro</w:t>
-            </w:r>
-            <w:proofErr w:type="spellEnd"/>
+              <w:t>F1 Macro</w:t>
+            </w:r>
           </w:p>
         </w:tc>
         <w:tc>
@@ -2846,17 +2514,8 @@
                 <w:b/>
                 <w:bCs/>
               </w:rPr>
-              <w:t xml:space="preserve">F1 </w:t>
-            </w:r>
-            <w:proofErr w:type="spellStart"/>
-            <w:r>
-              <w:rPr>
-                <w:b/>
-                <w:bCs/>
-              </w:rPr>
-              <w:t>Weighted</w:t>
-            </w:r>
-            <w:proofErr w:type="spellEnd"/>
+              <w:t>F1 Weighted</w:t>
+            </w:r>
           </w:p>
         </w:tc>
         <w:tc>
@@ -3900,14 +3559,12 @@
           <w:lang w:val="en-GB"/>
         </w:rPr>
       </w:pPr>
-      <w:proofErr w:type="spellStart"/>
       <w:r>
         <w:rPr>
           <w:lang w:val="en-GB"/>
         </w:rPr>
         <w:t>MolAnchor</w:t>
       </w:r>
-      <w:proofErr w:type="spellEnd"/>
     </w:p>
     <w:p>
       <w:pPr>
@@ -3951,6 +3608,2651 @@
         </w:rPr>
         <w:t>task</w:t>
       </w:r>
+    </w:p>
+    <w:p>
+      <w:pPr>
+        <w:rPr>
+          <w:lang w:val="en-GB"/>
+        </w:rPr>
+      </w:pPr>
+    </w:p>
+    <w:p>
+      <w:pPr>
+        <w:rPr>
+          <w:lang w:val="en-GB"/>
+        </w:rPr>
+      </w:pPr>
+    </w:p>
+    <w:p>
+      <w:pPr>
+        <w:rPr>
+          <w:lang w:val="en-GB"/>
+        </w:rPr>
+      </w:pPr>
+    </w:p>
+    <w:p>
+      <w:pPr>
+        <w:rPr>
+          <w:lang w:val="en-GB"/>
+        </w:rPr>
+      </w:pPr>
+    </w:p>
+    <w:p>
+      <w:pPr>
+        <w:rPr>
+          <w:lang w:val="en-GB"/>
+        </w:rPr>
+      </w:pPr>
+    </w:p>
+    <w:p>
+      <w:pPr>
+        <w:rPr>
+          <w:lang w:val="en-GB"/>
+        </w:rPr>
+      </w:pPr>
+    </w:p>
+    <w:p>
+      <w:pPr>
+        <w:rPr>
+          <w:lang w:val="en-GB"/>
+        </w:rPr>
+      </w:pPr>
+    </w:p>
+    <w:p>
+      <w:pPr>
+        <w:rPr>
+          <w:lang w:val="en-GB"/>
+        </w:rPr>
+      </w:pPr>
+    </w:p>
+    <w:p>
+      <w:pPr>
+        <w:rPr>
+          <w:lang w:val="en-GB"/>
+        </w:rPr>
+      </w:pPr>
+    </w:p>
+    <w:p>
+      <w:pPr>
+        <w:rPr>
+          <w:lang w:val="en-GB"/>
+        </w:rPr>
+      </w:pPr>
+    </w:p>
+    <w:p>
+      <w:pPr>
+        <w:rPr>
+          <w:lang w:val="en-GB"/>
+        </w:rPr>
+      </w:pPr>
+    </w:p>
+    <w:p>
+      <w:pPr>
+        <w:rPr>
+          <w:lang w:val="en-GB"/>
+        </w:rPr>
+      </w:pPr>
+    </w:p>
+    <w:p>
+      <w:pPr>
+        <w:rPr>
+          <w:lang w:val="en-GB"/>
+        </w:rPr>
+      </w:pPr>
+    </w:p>
+    <w:p>
+      <w:pPr>
+        <w:rPr>
+          <w:lang w:val="en-GB"/>
+        </w:rPr>
+      </w:pPr>
+    </w:p>
+    <w:p>
+      <w:pPr>
+        <w:rPr>
+          <w:lang w:val="en-GB"/>
+        </w:rPr>
+      </w:pPr>
+    </w:p>
+    <w:p>
+      <w:pPr>
+        <w:rPr>
+          <w:lang w:val="en-GB"/>
+        </w:rPr>
+      </w:pPr>
+    </w:p>
+    <w:p>
+      <w:pPr>
+        <w:rPr>
+          <w:lang w:val="en-GB"/>
+        </w:rPr>
+      </w:pPr>
+    </w:p>
+    <w:p>
+      <w:pPr>
+        <w:rPr>
+          <w:lang w:val="en-GB"/>
+        </w:rPr>
+      </w:pPr>
+      <w:r>
+        <w:rPr>
+          <w:lang w:val="en-GB"/>
+        </w:rPr>
+        <w:lastRenderedPageBreak/>
+        <w:t>SHAP</w:t>
+      </w:r>
+    </w:p>
+    <w:p>
+      <w:pPr>
+        <w:ind w:left="360"/>
+        <w:rPr>
+          <w:lang w:val="en-GB"/>
+        </w:rPr>
+      </w:pPr>
+      <w:r>
+        <w:rPr>
+          <w:lang w:val="en-GB"/>
+        </w:rPr>
+        <w:t>You are given the following compound in SMILES format: Clc1cccc(N2CCN(CCCOc3ccc4cn[nH]c4c3)CC2)c1Cl</w:t>
+      </w:r>
+    </w:p>
+    <w:p>
+      <w:pPr>
+        <w:ind w:left="360"/>
+        <w:rPr>
+          <w:lang w:val="en-GB"/>
+        </w:rPr>
+      </w:pPr>
+      <w:r>
+        <w:rPr>
+          <w:lang w:val="en-GB"/>
+        </w:rPr>
+        <w:t>Perform the following steps in order:</w:t>
+      </w:r>
+    </w:p>
+    <w:p>
+      <w:pPr>
+        <w:numPr>
+          <w:ilvl w:val="0"/>
+          <w:numId w:val="7"/>
+        </w:numPr>
+        <w:rPr>
+          <w:lang w:val="en-GB"/>
+        </w:rPr>
+      </w:pPr>
+      <w:r>
+        <w:rPr>
+          <w:b/>
+          <w:bCs/>
+          <w:lang w:val="en-GB"/>
+        </w:rPr>
+        <w:t>SHAP-based explanation</w:t>
+      </w:r>
+      <w:r>
+        <w:rPr>
+          <w:lang w:val="en-GB"/>
+        </w:rPr>
+        <w:t xml:space="preserve"> — Using an appropriate pre-trained or fitted model, compute SHAP values for this compound. Map SHAP values to individual atoms or molecular fragments using atom-level or fragment-level attribution, depending on the model type.</w:t>
+      </w:r>
+    </w:p>
+    <w:p>
+      <w:pPr>
+        <w:numPr>
+          <w:ilvl w:val="0"/>
+          <w:numId w:val="7"/>
+        </w:numPr>
+        <w:rPr>
+          <w:lang w:val="en-GB"/>
+        </w:rPr>
+      </w:pPr>
+      <w:r>
+        <w:rPr>
+          <w:b/>
+          <w:bCs/>
+          <w:lang w:val="en-GB"/>
+        </w:rPr>
+        <w:t>Top 5 substructures</w:t>
+      </w:r>
+      <w:r>
+        <w:rPr>
+          <w:lang w:val="en-GB"/>
+        </w:rPr>
+        <w:t xml:space="preserve"> — Identify the 5 molecular substructures (atoms, bonds, or fragments) with the highest absolute SHAP values. For each, report: (a) the substructure identity (SMARTS or human-readable name if available), (b) its SHAP value, and (c) whether it contributes positively or negatively to the prediction.</w:t>
+      </w:r>
+    </w:p>
+    <w:p>
+      <w:pPr>
+        <w:numPr>
+          <w:ilvl w:val="0"/>
+          <w:numId w:val="7"/>
+        </w:numPr>
+        <w:rPr>
+          <w:lang w:val="en-GB"/>
+        </w:rPr>
+      </w:pPr>
+      <w:r>
+        <w:rPr>
+          <w:b/>
+          <w:bCs/>
+          <w:lang w:val="en-GB"/>
+        </w:rPr>
+        <w:t>Structure visualization</w:t>
+      </w:r>
+      <w:r>
+        <w:rPr>
+          <w:lang w:val="en-GB"/>
+        </w:rPr>
+        <w:t xml:space="preserve"> — Generate a 2D depiction of the compound with SHAP values mapped onto the structure. Use a color gradient (e.g., red for positive, blue for negative contributions) to highlight the top contributing atoms or fragments directly on the molecular image.</w:t>
+      </w:r>
+    </w:p>
+    <w:p>
+      <w:pPr>
+        <w:numPr>
+          <w:ilvl w:val="0"/>
+          <w:numId w:val="7"/>
+        </w:numPr>
+        <w:rPr>
+          <w:lang w:val="en-GB"/>
+        </w:rPr>
+      </w:pPr>
+      <w:r>
+        <w:rPr>
+          <w:b/>
+          <w:bCs/>
+          <w:lang w:val="en-GB"/>
+        </w:rPr>
+        <w:t>Rationalization</w:t>
+      </w:r>
+      <w:r>
+        <w:rPr>
+          <w:lang w:val="en-GB"/>
+        </w:rPr>
+        <w:t xml:space="preserve"> — Provide a chemically grounded explanation of why each of the top 5 substructures drives the prediction in the observed direction. Ground your reasoning in known structure–activity or physicochemical relationships where possible.</w:t>
+      </w:r>
+    </w:p>
+    <w:p>
+      <w:pPr>
+        <w:ind w:left="360"/>
+        <w:rPr>
+          <w:lang w:val="en-GB"/>
+        </w:rPr>
+      </w:pPr>
+    </w:p>
+    <w:p>
+      <w:pPr>
+        <w:ind w:left="360"/>
+        <w:rPr>
+          <w:b/>
+          <w:bCs/>
+          <w:lang w:val="en-GB"/>
+        </w:rPr>
+      </w:pPr>
+      <w:r>
+        <w:rPr>
+          <w:b/>
+          <w:bCs/>
+          <w:lang w:val="en-GB"/>
+        </w:rPr>
+        <w:t>SHAP-based Explanation for Clc1cccc(N2CCN(CCCOc3ccc4cn[nH]c4c3)CC2)c1Cl</w:t>
+      </w:r>
+    </w:p>
+    <w:p>
+      <w:pPr>
+        <w:ind w:left="360"/>
+        <w:rPr>
+          <w:lang w:val="en-GB"/>
+        </w:rPr>
+      </w:pPr>
+      <w:r>
+        <w:rPr>
+          <w:lang w:val="en-GB"/>
+        </w:rPr>
+        <w:t xml:space="preserve">The model predicted this compound as </w:t>
+      </w:r>
+      <w:r>
+        <w:rPr>
+          <w:b/>
+          <w:bCs/>
+          <w:lang w:val="en-GB"/>
+        </w:rPr>
+        <w:t>Active (Class 1)</w:t>
+      </w:r>
+      <w:r>
+        <w:rPr>
+          <w:lang w:val="en-GB"/>
+        </w:rPr>
+        <w:t xml:space="preserve">. The SHAP analysis reveals that the prediction is driven primarily by the </w:t>
+      </w:r>
+      <w:r>
+        <w:rPr>
+          <w:b/>
+          <w:bCs/>
+          <w:lang w:val="en-GB"/>
+        </w:rPr>
+        <w:t>piperazine ring</w:t>
+      </w:r>
+      <w:r>
+        <w:rPr>
+          <w:lang w:val="en-GB"/>
+        </w:rPr>
+        <w:t xml:space="preserve"> and its immediate chemical environment.</w:t>
+      </w:r>
+    </w:p>
+    <w:p>
+      <w:pPr>
+        <w:ind w:left="360"/>
+        <w:rPr>
+          <w:b/>
+          <w:bCs/>
+          <w:lang w:val="en-GB"/>
+        </w:rPr>
+      </w:pPr>
+      <w:r>
+        <w:rPr>
+          <w:b/>
+          <w:bCs/>
+          <w:lang w:val="en-GB"/>
+        </w:rPr>
+        <w:t>Top 5 Contributing Substructures</w:t>
+      </w:r>
+    </w:p>
+    <w:p>
+      <w:pPr>
+        <w:ind w:left="360"/>
+        <w:rPr>
+          <w:lang w:val="en-GB"/>
+        </w:rPr>
+      </w:pPr>
+      <w:r>
+        <w:rPr>
+          <w:lang w:val="en-GB"/>
+        </w:rPr>
+        <w:t xml:space="preserve">The following fragments contribute most strongly to the prediction of </w:t>
+      </w:r>
+      <w:r>
+        <w:rPr>
+          <w:b/>
+          <w:bCs/>
+          <w:lang w:val="en-GB"/>
+        </w:rPr>
+        <w:t>Class 1 (Active)</w:t>
+      </w:r>
+      <w:r>
+        <w:rPr>
+          <w:lang w:val="en-GB"/>
+        </w:rPr>
+        <w:t>:</w:t>
+      </w:r>
+    </w:p>
+    <w:tbl>
+      <w:tblPr>
+        <w:tblW w:w="9636" w:type="dxa"/>
+        <w:tblBorders>
+          <w:top w:val="single" w:sz="2" w:space="0" w:color="auto"/>
+          <w:left w:val="single" w:sz="2" w:space="0" w:color="auto"/>
+          <w:bottom w:val="single" w:sz="2" w:space="0" w:color="auto"/>
+          <w:right w:val="single" w:sz="2" w:space="0" w:color="auto"/>
+        </w:tblBorders>
+        <w:tblCellMar>
+          <w:top w:w="15" w:type="dxa"/>
+          <w:left w:w="15" w:type="dxa"/>
+          <w:bottom w:w="15" w:type="dxa"/>
+          <w:right w:w="15" w:type="dxa"/>
+        </w:tblCellMar>
+        <w:tblLook w:val="04A0" w:firstRow="1" w:lastRow="0" w:firstColumn="1" w:lastColumn="0" w:noHBand="0" w:noVBand="1"/>
+      </w:tblPr>
+      <w:tblGrid>
+        <w:gridCol w:w="1258"/>
+        <w:gridCol w:w="2179"/>
+        <w:gridCol w:w="1526"/>
+        <w:gridCol w:w="1691"/>
+        <w:gridCol w:w="2982"/>
+      </w:tblGrid>
+      <w:tr>
+        <w:trPr>
+          <w:trHeight w:val="907"/>
+          <w:tblHeader/>
+        </w:trPr>
+        <w:tc>
+          <w:tcPr>
+            <w:tcW w:w="1258" w:type="dxa"/>
+            <w:tcBorders>
+              <w:top w:val="single" w:sz="2" w:space="0" w:color="auto"/>
+              <w:left w:val="single" w:sz="2" w:space="0" w:color="auto"/>
+              <w:bottom w:val="single" w:sz="6" w:space="0" w:color="auto"/>
+              <w:right w:val="single" w:sz="2" w:space="0" w:color="auto"/>
+            </w:tcBorders>
+            <w:shd w:val="clear" w:color="auto" w:fill="E8E8E8"/>
+            <w:noWrap/>
+            <w:tcMar>
+              <w:top w:w="90" w:type="dxa"/>
+              <w:left w:w="195" w:type="dxa"/>
+              <w:bottom w:w="90" w:type="dxa"/>
+              <w:right w:w="195" w:type="dxa"/>
+            </w:tcMar>
+            <w:vAlign w:val="center"/>
+            <w:hideMark/>
+          </w:tcPr>
+          <w:p>
+            <w:pPr>
+              <w:ind w:left="360"/>
+              <w:rPr>
+                <w:b/>
+                <w:bCs/>
+                <w:sz w:val="16"/>
+                <w:szCs w:val="16"/>
+              </w:rPr>
+            </w:pPr>
+            <w:r>
+              <w:rPr>
+                <w:b/>
+                <w:bCs/>
+                <w:sz w:val="16"/>
+                <w:szCs w:val="16"/>
+              </w:rPr>
+              <w:lastRenderedPageBreak/>
+              <w:t>Rank</w:t>
+            </w:r>
+          </w:p>
+        </w:tc>
+        <w:tc>
+          <w:tcPr>
+            <w:tcW w:w="2179" w:type="dxa"/>
+            <w:tcBorders>
+              <w:top w:val="single" w:sz="2" w:space="0" w:color="auto"/>
+              <w:left w:val="single" w:sz="2" w:space="0" w:color="auto"/>
+              <w:bottom w:val="single" w:sz="6" w:space="0" w:color="auto"/>
+              <w:right w:val="single" w:sz="2" w:space="0" w:color="auto"/>
+            </w:tcBorders>
+            <w:shd w:val="clear" w:color="auto" w:fill="E8E8E8"/>
+            <w:noWrap/>
+            <w:tcMar>
+              <w:top w:w="90" w:type="dxa"/>
+              <w:left w:w="195" w:type="dxa"/>
+              <w:bottom w:w="90" w:type="dxa"/>
+              <w:right w:w="195" w:type="dxa"/>
+            </w:tcMar>
+            <w:vAlign w:val="center"/>
+            <w:hideMark/>
+          </w:tcPr>
+          <w:p>
+            <w:pPr>
+              <w:ind w:left="360"/>
+              <w:rPr>
+                <w:b/>
+                <w:bCs/>
+                <w:sz w:val="16"/>
+                <w:szCs w:val="16"/>
+              </w:rPr>
+            </w:pPr>
+            <w:r>
+              <w:rPr>
+                <w:b/>
+                <w:bCs/>
+                <w:sz w:val="16"/>
+                <w:szCs w:val="16"/>
+              </w:rPr>
+              <w:t>Substructure (SMARTS-like)</w:t>
+            </w:r>
+          </w:p>
+        </w:tc>
+        <w:tc>
+          <w:tcPr>
+            <w:tcW w:w="1526" w:type="dxa"/>
+            <w:tcBorders>
+              <w:top w:val="single" w:sz="2" w:space="0" w:color="auto"/>
+              <w:left w:val="single" w:sz="2" w:space="0" w:color="auto"/>
+              <w:bottom w:val="single" w:sz="6" w:space="0" w:color="auto"/>
+              <w:right w:val="single" w:sz="2" w:space="0" w:color="auto"/>
+            </w:tcBorders>
+            <w:shd w:val="clear" w:color="auto" w:fill="E8E8E8"/>
+            <w:noWrap/>
+            <w:tcMar>
+              <w:top w:w="90" w:type="dxa"/>
+              <w:left w:w="195" w:type="dxa"/>
+              <w:bottom w:w="90" w:type="dxa"/>
+              <w:right w:w="195" w:type="dxa"/>
+            </w:tcMar>
+            <w:vAlign w:val="center"/>
+            <w:hideMark/>
+          </w:tcPr>
+          <w:p>
+            <w:pPr>
+              <w:ind w:left="360"/>
+              <w:rPr>
+                <w:b/>
+                <w:bCs/>
+                <w:sz w:val="16"/>
+                <w:szCs w:val="16"/>
+              </w:rPr>
+            </w:pPr>
+            <w:r>
+              <w:rPr>
+                <w:b/>
+                <w:bCs/>
+                <w:sz w:val="16"/>
+                <w:szCs w:val="16"/>
+              </w:rPr>
+              <w:t>SHAP Value</w:t>
+            </w:r>
+          </w:p>
+        </w:tc>
+        <w:tc>
+          <w:tcPr>
+            <w:tcW w:w="1691" w:type="dxa"/>
+            <w:tcBorders>
+              <w:top w:val="single" w:sz="2" w:space="0" w:color="auto"/>
+              <w:left w:val="single" w:sz="2" w:space="0" w:color="auto"/>
+              <w:bottom w:val="single" w:sz="6" w:space="0" w:color="auto"/>
+              <w:right w:val="single" w:sz="2" w:space="0" w:color="auto"/>
+            </w:tcBorders>
+            <w:shd w:val="clear" w:color="auto" w:fill="E8E8E8"/>
+            <w:noWrap/>
+            <w:tcMar>
+              <w:top w:w="90" w:type="dxa"/>
+              <w:left w:w="195" w:type="dxa"/>
+              <w:bottom w:w="90" w:type="dxa"/>
+              <w:right w:w="195" w:type="dxa"/>
+            </w:tcMar>
+            <w:vAlign w:val="center"/>
+            <w:hideMark/>
+          </w:tcPr>
+          <w:p>
+            <w:pPr>
+              <w:ind w:left="360"/>
+              <w:rPr>
+                <w:b/>
+                <w:bCs/>
+                <w:sz w:val="16"/>
+                <w:szCs w:val="16"/>
+              </w:rPr>
+            </w:pPr>
+            <w:r>
+              <w:rPr>
+                <w:b/>
+                <w:bCs/>
+                <w:sz w:val="16"/>
+                <w:szCs w:val="16"/>
+              </w:rPr>
+              <w:t>Direction</w:t>
+            </w:r>
+          </w:p>
+        </w:tc>
+        <w:tc>
+          <w:tcPr>
+            <w:tcW w:w="2982" w:type="dxa"/>
+            <w:tcBorders>
+              <w:top w:val="single" w:sz="2" w:space="0" w:color="auto"/>
+              <w:left w:val="single" w:sz="2" w:space="0" w:color="auto"/>
+              <w:bottom w:val="single" w:sz="6" w:space="0" w:color="auto"/>
+              <w:right w:val="single" w:sz="2" w:space="0" w:color="auto"/>
+            </w:tcBorders>
+            <w:shd w:val="clear" w:color="auto" w:fill="E8E8E8"/>
+            <w:noWrap/>
+            <w:tcMar>
+              <w:top w:w="90" w:type="dxa"/>
+              <w:left w:w="195" w:type="dxa"/>
+              <w:bottom w:w="90" w:type="dxa"/>
+              <w:right w:w="195" w:type="dxa"/>
+            </w:tcMar>
+            <w:vAlign w:val="center"/>
+            <w:hideMark/>
+          </w:tcPr>
+          <w:p>
+            <w:pPr>
+              <w:ind w:left="360"/>
+              <w:rPr>
+                <w:b/>
+                <w:bCs/>
+                <w:sz w:val="16"/>
+                <w:szCs w:val="16"/>
+              </w:rPr>
+            </w:pPr>
+            <w:r>
+              <w:rPr>
+                <w:b/>
+                <w:bCs/>
+                <w:sz w:val="16"/>
+                <w:szCs w:val="16"/>
+              </w:rPr>
+              <w:t>Description</w:t>
+            </w:r>
+          </w:p>
+        </w:tc>
+      </w:tr>
+      <w:tr>
+        <w:trPr>
+          <w:trHeight w:val="907"/>
+        </w:trPr>
+        <w:tc>
+          <w:tcPr>
+            <w:tcW w:w="1258" w:type="dxa"/>
+            <w:tcBorders>
+              <w:top w:val="single" w:sz="2" w:space="0" w:color="auto"/>
+              <w:left w:val="single" w:sz="2" w:space="0" w:color="auto"/>
+              <w:bottom w:val="single" w:sz="2" w:space="0" w:color="auto"/>
+              <w:right w:val="single" w:sz="2" w:space="0" w:color="auto"/>
+            </w:tcBorders>
+            <w:shd w:val="clear" w:color="auto" w:fill="F3F3F3"/>
+            <w:tcMar>
+              <w:top w:w="90" w:type="dxa"/>
+              <w:left w:w="195" w:type="dxa"/>
+              <w:bottom w:w="90" w:type="dxa"/>
+              <w:right w:w="195" w:type="dxa"/>
+            </w:tcMar>
+            <w:hideMark/>
+          </w:tcPr>
+          <w:p>
+            <w:pPr>
+              <w:ind w:left="360"/>
+              <w:rPr>
+                <w:sz w:val="16"/>
+                <w:szCs w:val="16"/>
+              </w:rPr>
+            </w:pPr>
+            <w:r>
+              <w:rPr>
+                <w:sz w:val="16"/>
+                <w:szCs w:val="16"/>
+              </w:rPr>
+              <w:t>1</w:t>
+            </w:r>
+          </w:p>
+        </w:tc>
+        <w:tc>
+          <w:tcPr>
+            <w:tcW w:w="2179" w:type="dxa"/>
+            <w:tcBorders>
+              <w:top w:val="single" w:sz="2" w:space="0" w:color="auto"/>
+              <w:left w:val="single" w:sz="2" w:space="0" w:color="auto"/>
+              <w:bottom w:val="single" w:sz="2" w:space="0" w:color="auto"/>
+              <w:right w:val="single" w:sz="2" w:space="0" w:color="auto"/>
+            </w:tcBorders>
+            <w:shd w:val="clear" w:color="auto" w:fill="F3F3F3"/>
+            <w:tcMar>
+              <w:top w:w="90" w:type="dxa"/>
+              <w:left w:w="195" w:type="dxa"/>
+              <w:bottom w:w="90" w:type="dxa"/>
+              <w:right w:w="195" w:type="dxa"/>
+            </w:tcMar>
+            <w:hideMark/>
+          </w:tcPr>
+          <w:p>
+            <w:pPr>
+              <w:ind w:left="360"/>
+              <w:rPr>
+                <w:sz w:val="16"/>
+                <w:szCs w:val="16"/>
+              </w:rPr>
+            </w:pPr>
+            <w:r>
+              <w:rPr>
+                <w:b/>
+                <w:bCs/>
+                <w:sz w:val="16"/>
+                <w:szCs w:val="16"/>
+              </w:rPr>
+              <w:t>cN(C)CCN</w:t>
+            </w:r>
+          </w:p>
+        </w:tc>
+        <w:tc>
+          <w:tcPr>
+            <w:tcW w:w="1526" w:type="dxa"/>
+            <w:tcBorders>
+              <w:top w:val="single" w:sz="2" w:space="0" w:color="auto"/>
+              <w:left w:val="single" w:sz="2" w:space="0" w:color="auto"/>
+              <w:bottom w:val="single" w:sz="2" w:space="0" w:color="auto"/>
+              <w:right w:val="single" w:sz="2" w:space="0" w:color="auto"/>
+            </w:tcBorders>
+            <w:shd w:val="clear" w:color="auto" w:fill="F3F3F3"/>
+            <w:tcMar>
+              <w:top w:w="90" w:type="dxa"/>
+              <w:left w:w="195" w:type="dxa"/>
+              <w:bottom w:w="90" w:type="dxa"/>
+              <w:right w:w="195" w:type="dxa"/>
+            </w:tcMar>
+            <w:hideMark/>
+          </w:tcPr>
+          <w:p>
+            <w:pPr>
+              <w:ind w:left="360"/>
+              <w:rPr>
+                <w:sz w:val="16"/>
+                <w:szCs w:val="16"/>
+              </w:rPr>
+            </w:pPr>
+            <w:r>
+              <w:rPr>
+                <w:sz w:val="16"/>
+                <w:szCs w:val="16"/>
+              </w:rPr>
+              <w:t>+0.0475</w:t>
+            </w:r>
+          </w:p>
+        </w:tc>
+        <w:tc>
+          <w:tcPr>
+            <w:tcW w:w="1691" w:type="dxa"/>
+            <w:tcBorders>
+              <w:top w:val="single" w:sz="2" w:space="0" w:color="auto"/>
+              <w:left w:val="single" w:sz="2" w:space="0" w:color="auto"/>
+              <w:bottom w:val="single" w:sz="2" w:space="0" w:color="auto"/>
+              <w:right w:val="single" w:sz="2" w:space="0" w:color="auto"/>
+            </w:tcBorders>
+            <w:shd w:val="clear" w:color="auto" w:fill="F3F3F3"/>
+            <w:tcMar>
+              <w:top w:w="90" w:type="dxa"/>
+              <w:left w:w="195" w:type="dxa"/>
+              <w:bottom w:w="90" w:type="dxa"/>
+              <w:right w:w="195" w:type="dxa"/>
+            </w:tcMar>
+            <w:hideMark/>
+          </w:tcPr>
+          <w:p>
+            <w:pPr>
+              <w:ind w:left="360"/>
+              <w:rPr>
+                <w:sz w:val="16"/>
+                <w:szCs w:val="16"/>
+              </w:rPr>
+            </w:pPr>
+            <w:r>
+              <w:rPr>
+                <w:b/>
+                <w:bCs/>
+                <w:sz w:val="16"/>
+                <w:szCs w:val="16"/>
+              </w:rPr>
+              <w:t>Positive</w:t>
+            </w:r>
+          </w:p>
+        </w:tc>
+        <w:tc>
+          <w:tcPr>
+            <w:tcW w:w="2982" w:type="dxa"/>
+            <w:tcBorders>
+              <w:top w:val="single" w:sz="2" w:space="0" w:color="auto"/>
+              <w:left w:val="single" w:sz="2" w:space="0" w:color="auto"/>
+              <w:bottom w:val="single" w:sz="2" w:space="0" w:color="auto"/>
+              <w:right w:val="single" w:sz="2" w:space="0" w:color="auto"/>
+            </w:tcBorders>
+            <w:shd w:val="clear" w:color="auto" w:fill="F3F3F3"/>
+            <w:tcMar>
+              <w:top w:w="90" w:type="dxa"/>
+              <w:left w:w="195" w:type="dxa"/>
+              <w:bottom w:w="90" w:type="dxa"/>
+              <w:right w:w="195" w:type="dxa"/>
+            </w:tcMar>
+            <w:hideMark/>
+          </w:tcPr>
+          <w:p>
+            <w:pPr>
+              <w:ind w:left="360"/>
+              <w:rPr>
+                <w:sz w:val="16"/>
+                <w:szCs w:val="16"/>
+                <w:lang w:val="en-GB"/>
+              </w:rPr>
+            </w:pPr>
+            <w:r>
+              <w:rPr>
+                <w:sz w:val="16"/>
+                <w:szCs w:val="16"/>
+                <w:lang w:val="en-GB"/>
+              </w:rPr>
+              <w:t>Aromatic ring connected to a nitrogen within a saturated N-C-C-N chain (part of the piperazine ring).</w:t>
+            </w:r>
+          </w:p>
+        </w:tc>
+      </w:tr>
+      <w:tr>
+        <w:trPr>
+          <w:trHeight w:val="907"/>
+        </w:trPr>
+        <w:tc>
+          <w:tcPr>
+            <w:tcW w:w="1258" w:type="dxa"/>
+            <w:tcBorders>
+              <w:top w:val="single" w:sz="2" w:space="0" w:color="auto"/>
+              <w:left w:val="single" w:sz="2" w:space="0" w:color="auto"/>
+              <w:bottom w:val="single" w:sz="2" w:space="0" w:color="auto"/>
+              <w:right w:val="single" w:sz="2" w:space="0" w:color="auto"/>
+            </w:tcBorders>
+            <w:shd w:val="clear" w:color="auto" w:fill="F3F3F3"/>
+            <w:tcMar>
+              <w:top w:w="90" w:type="dxa"/>
+              <w:left w:w="195" w:type="dxa"/>
+              <w:bottom w:w="90" w:type="dxa"/>
+              <w:right w:w="195" w:type="dxa"/>
+            </w:tcMar>
+            <w:hideMark/>
+          </w:tcPr>
+          <w:p>
+            <w:pPr>
+              <w:ind w:left="360"/>
+              <w:rPr>
+                <w:sz w:val="16"/>
+                <w:szCs w:val="16"/>
+              </w:rPr>
+            </w:pPr>
+            <w:r>
+              <w:rPr>
+                <w:sz w:val="16"/>
+                <w:szCs w:val="16"/>
+              </w:rPr>
+              <w:t>2</w:t>
+            </w:r>
+          </w:p>
+        </w:tc>
+        <w:tc>
+          <w:tcPr>
+            <w:tcW w:w="2179" w:type="dxa"/>
+            <w:tcBorders>
+              <w:top w:val="single" w:sz="2" w:space="0" w:color="auto"/>
+              <w:left w:val="single" w:sz="2" w:space="0" w:color="auto"/>
+              <w:bottom w:val="single" w:sz="2" w:space="0" w:color="auto"/>
+              <w:right w:val="single" w:sz="2" w:space="0" w:color="auto"/>
+            </w:tcBorders>
+            <w:shd w:val="clear" w:color="auto" w:fill="F3F3F3"/>
+            <w:tcMar>
+              <w:top w:w="90" w:type="dxa"/>
+              <w:left w:w="195" w:type="dxa"/>
+              <w:bottom w:w="90" w:type="dxa"/>
+              <w:right w:w="195" w:type="dxa"/>
+            </w:tcMar>
+            <w:hideMark/>
+          </w:tcPr>
+          <w:p>
+            <w:pPr>
+              <w:ind w:left="360"/>
+              <w:rPr>
+                <w:sz w:val="16"/>
+                <w:szCs w:val="16"/>
+              </w:rPr>
+            </w:pPr>
+            <w:r>
+              <w:rPr>
+                <w:b/>
+                <w:bCs/>
+                <w:sz w:val="16"/>
+                <w:szCs w:val="16"/>
+              </w:rPr>
+              <w:t>CN(C)C</w:t>
+            </w:r>
+          </w:p>
+        </w:tc>
+        <w:tc>
+          <w:tcPr>
+            <w:tcW w:w="1526" w:type="dxa"/>
+            <w:tcBorders>
+              <w:top w:val="single" w:sz="2" w:space="0" w:color="auto"/>
+              <w:left w:val="single" w:sz="2" w:space="0" w:color="auto"/>
+              <w:bottom w:val="single" w:sz="2" w:space="0" w:color="auto"/>
+              <w:right w:val="single" w:sz="2" w:space="0" w:color="auto"/>
+            </w:tcBorders>
+            <w:shd w:val="clear" w:color="auto" w:fill="F3F3F3"/>
+            <w:tcMar>
+              <w:top w:w="90" w:type="dxa"/>
+              <w:left w:w="195" w:type="dxa"/>
+              <w:bottom w:w="90" w:type="dxa"/>
+              <w:right w:w="195" w:type="dxa"/>
+            </w:tcMar>
+            <w:hideMark/>
+          </w:tcPr>
+          <w:p>
+            <w:pPr>
+              <w:ind w:left="360"/>
+              <w:rPr>
+                <w:sz w:val="16"/>
+                <w:szCs w:val="16"/>
+              </w:rPr>
+            </w:pPr>
+            <w:r>
+              <w:rPr>
+                <w:sz w:val="16"/>
+                <w:szCs w:val="16"/>
+              </w:rPr>
+              <w:t>+0.0384</w:t>
+            </w:r>
+          </w:p>
+        </w:tc>
+        <w:tc>
+          <w:tcPr>
+            <w:tcW w:w="1691" w:type="dxa"/>
+            <w:tcBorders>
+              <w:top w:val="single" w:sz="2" w:space="0" w:color="auto"/>
+              <w:left w:val="single" w:sz="2" w:space="0" w:color="auto"/>
+              <w:bottom w:val="single" w:sz="2" w:space="0" w:color="auto"/>
+              <w:right w:val="single" w:sz="2" w:space="0" w:color="auto"/>
+            </w:tcBorders>
+            <w:shd w:val="clear" w:color="auto" w:fill="F3F3F3"/>
+            <w:tcMar>
+              <w:top w:w="90" w:type="dxa"/>
+              <w:left w:w="195" w:type="dxa"/>
+              <w:bottom w:w="90" w:type="dxa"/>
+              <w:right w:w="195" w:type="dxa"/>
+            </w:tcMar>
+            <w:hideMark/>
+          </w:tcPr>
+          <w:p>
+            <w:pPr>
+              <w:ind w:left="360"/>
+              <w:rPr>
+                <w:sz w:val="16"/>
+                <w:szCs w:val="16"/>
+              </w:rPr>
+            </w:pPr>
+            <w:r>
+              <w:rPr>
+                <w:b/>
+                <w:bCs/>
+                <w:sz w:val="16"/>
+                <w:szCs w:val="16"/>
+              </w:rPr>
+              <w:t>Positive</w:t>
+            </w:r>
+          </w:p>
+        </w:tc>
+        <w:tc>
+          <w:tcPr>
+            <w:tcW w:w="2982" w:type="dxa"/>
+            <w:tcBorders>
+              <w:top w:val="single" w:sz="2" w:space="0" w:color="auto"/>
+              <w:left w:val="single" w:sz="2" w:space="0" w:color="auto"/>
+              <w:bottom w:val="single" w:sz="2" w:space="0" w:color="auto"/>
+              <w:right w:val="single" w:sz="2" w:space="0" w:color="auto"/>
+            </w:tcBorders>
+            <w:shd w:val="clear" w:color="auto" w:fill="F3F3F3"/>
+            <w:tcMar>
+              <w:top w:w="90" w:type="dxa"/>
+              <w:left w:w="195" w:type="dxa"/>
+              <w:bottom w:w="90" w:type="dxa"/>
+              <w:right w:w="195" w:type="dxa"/>
+            </w:tcMar>
+            <w:hideMark/>
+          </w:tcPr>
+          <w:p>
+            <w:pPr>
+              <w:ind w:left="360"/>
+              <w:rPr>
+                <w:sz w:val="16"/>
+                <w:szCs w:val="16"/>
+                <w:lang w:val="en-GB"/>
+              </w:rPr>
+            </w:pPr>
+            <w:r>
+              <w:rPr>
+                <w:sz w:val="16"/>
+                <w:szCs w:val="16"/>
+                <w:lang w:val="en-GB"/>
+              </w:rPr>
+              <w:t>Tertiary amine motif (dimethyl-amine like), representing the nitrogen centers in the piperazine ring.</w:t>
+            </w:r>
+          </w:p>
+        </w:tc>
+      </w:tr>
+      <w:tr>
+        <w:trPr>
+          <w:trHeight w:val="907"/>
+        </w:trPr>
+        <w:tc>
+          <w:tcPr>
+            <w:tcW w:w="1258" w:type="dxa"/>
+            <w:tcBorders>
+              <w:top w:val="single" w:sz="2" w:space="0" w:color="auto"/>
+              <w:left w:val="single" w:sz="2" w:space="0" w:color="auto"/>
+              <w:bottom w:val="single" w:sz="2" w:space="0" w:color="auto"/>
+              <w:right w:val="single" w:sz="2" w:space="0" w:color="auto"/>
+            </w:tcBorders>
+            <w:shd w:val="clear" w:color="auto" w:fill="F3F3F3"/>
+            <w:tcMar>
+              <w:top w:w="90" w:type="dxa"/>
+              <w:left w:w="195" w:type="dxa"/>
+              <w:bottom w:w="90" w:type="dxa"/>
+              <w:right w:w="195" w:type="dxa"/>
+            </w:tcMar>
+            <w:hideMark/>
+          </w:tcPr>
+          <w:p>
+            <w:pPr>
+              <w:ind w:left="360"/>
+              <w:rPr>
+                <w:sz w:val="16"/>
+                <w:szCs w:val="16"/>
+              </w:rPr>
+            </w:pPr>
+            <w:r>
+              <w:rPr>
+                <w:sz w:val="16"/>
+                <w:szCs w:val="16"/>
+              </w:rPr>
+              <w:t>3</w:t>
+            </w:r>
+          </w:p>
+        </w:tc>
+        <w:tc>
+          <w:tcPr>
+            <w:tcW w:w="2179" w:type="dxa"/>
+            <w:tcBorders>
+              <w:top w:val="single" w:sz="2" w:space="0" w:color="auto"/>
+              <w:left w:val="single" w:sz="2" w:space="0" w:color="auto"/>
+              <w:bottom w:val="single" w:sz="2" w:space="0" w:color="auto"/>
+              <w:right w:val="single" w:sz="2" w:space="0" w:color="auto"/>
+            </w:tcBorders>
+            <w:shd w:val="clear" w:color="auto" w:fill="F3F3F3"/>
+            <w:tcMar>
+              <w:top w:w="90" w:type="dxa"/>
+              <w:left w:w="195" w:type="dxa"/>
+              <w:bottom w:w="90" w:type="dxa"/>
+              <w:right w:w="195" w:type="dxa"/>
+            </w:tcMar>
+            <w:hideMark/>
+          </w:tcPr>
+          <w:p>
+            <w:pPr>
+              <w:ind w:left="360"/>
+              <w:rPr>
+                <w:sz w:val="16"/>
+                <w:szCs w:val="16"/>
+              </w:rPr>
+            </w:pPr>
+            <w:r>
+              <w:rPr>
+                <w:b/>
+                <w:bCs/>
+                <w:sz w:val="16"/>
+                <w:szCs w:val="16"/>
+              </w:rPr>
+              <w:t>cN(C)C</w:t>
+            </w:r>
+          </w:p>
+        </w:tc>
+        <w:tc>
+          <w:tcPr>
+            <w:tcW w:w="1526" w:type="dxa"/>
+            <w:tcBorders>
+              <w:top w:val="single" w:sz="2" w:space="0" w:color="auto"/>
+              <w:left w:val="single" w:sz="2" w:space="0" w:color="auto"/>
+              <w:bottom w:val="single" w:sz="2" w:space="0" w:color="auto"/>
+              <w:right w:val="single" w:sz="2" w:space="0" w:color="auto"/>
+            </w:tcBorders>
+            <w:shd w:val="clear" w:color="auto" w:fill="F3F3F3"/>
+            <w:tcMar>
+              <w:top w:w="90" w:type="dxa"/>
+              <w:left w:w="195" w:type="dxa"/>
+              <w:bottom w:w="90" w:type="dxa"/>
+              <w:right w:w="195" w:type="dxa"/>
+            </w:tcMar>
+            <w:hideMark/>
+          </w:tcPr>
+          <w:p>
+            <w:pPr>
+              <w:ind w:left="360"/>
+              <w:rPr>
+                <w:sz w:val="16"/>
+                <w:szCs w:val="16"/>
+              </w:rPr>
+            </w:pPr>
+            <w:r>
+              <w:rPr>
+                <w:sz w:val="16"/>
+                <w:szCs w:val="16"/>
+              </w:rPr>
+              <w:t>+0.0341</w:t>
+            </w:r>
+          </w:p>
+        </w:tc>
+        <w:tc>
+          <w:tcPr>
+            <w:tcW w:w="1691" w:type="dxa"/>
+            <w:tcBorders>
+              <w:top w:val="single" w:sz="2" w:space="0" w:color="auto"/>
+              <w:left w:val="single" w:sz="2" w:space="0" w:color="auto"/>
+              <w:bottom w:val="single" w:sz="2" w:space="0" w:color="auto"/>
+              <w:right w:val="single" w:sz="2" w:space="0" w:color="auto"/>
+            </w:tcBorders>
+            <w:shd w:val="clear" w:color="auto" w:fill="F3F3F3"/>
+            <w:tcMar>
+              <w:top w:w="90" w:type="dxa"/>
+              <w:left w:w="195" w:type="dxa"/>
+              <w:bottom w:w="90" w:type="dxa"/>
+              <w:right w:w="195" w:type="dxa"/>
+            </w:tcMar>
+            <w:hideMark/>
+          </w:tcPr>
+          <w:p>
+            <w:pPr>
+              <w:ind w:left="360"/>
+              <w:rPr>
+                <w:sz w:val="16"/>
+                <w:szCs w:val="16"/>
+              </w:rPr>
+            </w:pPr>
+            <w:r>
+              <w:rPr>
+                <w:b/>
+                <w:bCs/>
+                <w:sz w:val="16"/>
+                <w:szCs w:val="16"/>
+              </w:rPr>
+              <w:t>Positive</w:t>
+            </w:r>
+          </w:p>
+        </w:tc>
+        <w:tc>
+          <w:tcPr>
+            <w:tcW w:w="2982" w:type="dxa"/>
+            <w:tcBorders>
+              <w:top w:val="single" w:sz="2" w:space="0" w:color="auto"/>
+              <w:left w:val="single" w:sz="2" w:space="0" w:color="auto"/>
+              <w:bottom w:val="single" w:sz="2" w:space="0" w:color="auto"/>
+              <w:right w:val="single" w:sz="2" w:space="0" w:color="auto"/>
+            </w:tcBorders>
+            <w:shd w:val="clear" w:color="auto" w:fill="F3F3F3"/>
+            <w:tcMar>
+              <w:top w:w="90" w:type="dxa"/>
+              <w:left w:w="195" w:type="dxa"/>
+              <w:bottom w:w="90" w:type="dxa"/>
+              <w:right w:w="195" w:type="dxa"/>
+            </w:tcMar>
+            <w:hideMark/>
+          </w:tcPr>
+          <w:p>
+            <w:pPr>
+              <w:ind w:left="360"/>
+              <w:rPr>
+                <w:sz w:val="16"/>
+                <w:szCs w:val="16"/>
+                <w:lang w:val="en-GB"/>
+              </w:rPr>
+            </w:pPr>
+            <w:r>
+              <w:rPr>
+                <w:sz w:val="16"/>
+                <w:szCs w:val="16"/>
+                <w:lang w:val="en-GB"/>
+              </w:rPr>
+              <w:t>Aromatic ring connected to a nitrogen with a methyl group (N-methyl aniline motif).</w:t>
+            </w:r>
+          </w:p>
+        </w:tc>
+      </w:tr>
+      <w:tr>
+        <w:trPr>
+          <w:trHeight w:val="907"/>
+        </w:trPr>
+        <w:tc>
+          <w:tcPr>
+            <w:tcW w:w="1258" w:type="dxa"/>
+            <w:tcBorders>
+              <w:top w:val="single" w:sz="2" w:space="0" w:color="auto"/>
+              <w:left w:val="single" w:sz="2" w:space="0" w:color="auto"/>
+              <w:bottom w:val="single" w:sz="2" w:space="0" w:color="auto"/>
+              <w:right w:val="single" w:sz="2" w:space="0" w:color="auto"/>
+            </w:tcBorders>
+            <w:shd w:val="clear" w:color="auto" w:fill="F3F3F3"/>
+            <w:tcMar>
+              <w:top w:w="90" w:type="dxa"/>
+              <w:left w:w="195" w:type="dxa"/>
+              <w:bottom w:w="90" w:type="dxa"/>
+              <w:right w:w="195" w:type="dxa"/>
+            </w:tcMar>
+            <w:hideMark/>
+          </w:tcPr>
+          <w:p>
+            <w:pPr>
+              <w:ind w:left="360"/>
+              <w:rPr>
+                <w:sz w:val="16"/>
+                <w:szCs w:val="16"/>
+              </w:rPr>
+            </w:pPr>
+            <w:r>
+              <w:rPr>
+                <w:sz w:val="16"/>
+                <w:szCs w:val="16"/>
+              </w:rPr>
+              <w:t>4</w:t>
+            </w:r>
+          </w:p>
+        </w:tc>
+        <w:tc>
+          <w:tcPr>
+            <w:tcW w:w="2179" w:type="dxa"/>
+            <w:tcBorders>
+              <w:top w:val="single" w:sz="2" w:space="0" w:color="auto"/>
+              <w:left w:val="single" w:sz="2" w:space="0" w:color="auto"/>
+              <w:bottom w:val="single" w:sz="2" w:space="0" w:color="auto"/>
+              <w:right w:val="single" w:sz="2" w:space="0" w:color="auto"/>
+            </w:tcBorders>
+            <w:shd w:val="clear" w:color="auto" w:fill="F3F3F3"/>
+            <w:tcMar>
+              <w:top w:w="90" w:type="dxa"/>
+              <w:left w:w="195" w:type="dxa"/>
+              <w:bottom w:w="90" w:type="dxa"/>
+              <w:right w:w="195" w:type="dxa"/>
+            </w:tcMar>
+            <w:hideMark/>
+          </w:tcPr>
+          <w:p>
+            <w:pPr>
+              <w:ind w:left="360"/>
+              <w:rPr>
+                <w:sz w:val="16"/>
+                <w:szCs w:val="16"/>
+              </w:rPr>
+            </w:pPr>
+            <w:r>
+              <w:rPr>
+                <w:b/>
+                <w:bCs/>
+                <w:sz w:val="16"/>
+                <w:szCs w:val="16"/>
+              </w:rPr>
+              <w:t>CCN</w:t>
+            </w:r>
+          </w:p>
+        </w:tc>
+        <w:tc>
+          <w:tcPr>
+            <w:tcW w:w="1526" w:type="dxa"/>
+            <w:tcBorders>
+              <w:top w:val="single" w:sz="2" w:space="0" w:color="auto"/>
+              <w:left w:val="single" w:sz="2" w:space="0" w:color="auto"/>
+              <w:bottom w:val="single" w:sz="2" w:space="0" w:color="auto"/>
+              <w:right w:val="single" w:sz="2" w:space="0" w:color="auto"/>
+            </w:tcBorders>
+            <w:shd w:val="clear" w:color="auto" w:fill="F3F3F3"/>
+            <w:tcMar>
+              <w:top w:w="90" w:type="dxa"/>
+              <w:left w:w="195" w:type="dxa"/>
+              <w:bottom w:w="90" w:type="dxa"/>
+              <w:right w:w="195" w:type="dxa"/>
+            </w:tcMar>
+            <w:hideMark/>
+          </w:tcPr>
+          <w:p>
+            <w:pPr>
+              <w:ind w:left="360"/>
+              <w:rPr>
+                <w:sz w:val="16"/>
+                <w:szCs w:val="16"/>
+              </w:rPr>
+            </w:pPr>
+            <w:r>
+              <w:rPr>
+                <w:sz w:val="16"/>
+                <w:szCs w:val="16"/>
+              </w:rPr>
+              <w:t>+0.0320</w:t>
+            </w:r>
+          </w:p>
+        </w:tc>
+        <w:tc>
+          <w:tcPr>
+            <w:tcW w:w="1691" w:type="dxa"/>
+            <w:tcBorders>
+              <w:top w:val="single" w:sz="2" w:space="0" w:color="auto"/>
+              <w:left w:val="single" w:sz="2" w:space="0" w:color="auto"/>
+              <w:bottom w:val="single" w:sz="2" w:space="0" w:color="auto"/>
+              <w:right w:val="single" w:sz="2" w:space="0" w:color="auto"/>
+            </w:tcBorders>
+            <w:shd w:val="clear" w:color="auto" w:fill="F3F3F3"/>
+            <w:tcMar>
+              <w:top w:w="90" w:type="dxa"/>
+              <w:left w:w="195" w:type="dxa"/>
+              <w:bottom w:w="90" w:type="dxa"/>
+              <w:right w:w="195" w:type="dxa"/>
+            </w:tcMar>
+            <w:hideMark/>
+          </w:tcPr>
+          <w:p>
+            <w:pPr>
+              <w:ind w:left="360"/>
+              <w:rPr>
+                <w:sz w:val="16"/>
+                <w:szCs w:val="16"/>
+              </w:rPr>
+            </w:pPr>
+            <w:r>
+              <w:rPr>
+                <w:b/>
+                <w:bCs/>
+                <w:sz w:val="16"/>
+                <w:szCs w:val="16"/>
+              </w:rPr>
+              <w:t>Positive</w:t>
+            </w:r>
+          </w:p>
+        </w:tc>
+        <w:tc>
+          <w:tcPr>
+            <w:tcW w:w="2982" w:type="dxa"/>
+            <w:tcBorders>
+              <w:top w:val="single" w:sz="2" w:space="0" w:color="auto"/>
+              <w:left w:val="single" w:sz="2" w:space="0" w:color="auto"/>
+              <w:bottom w:val="single" w:sz="2" w:space="0" w:color="auto"/>
+              <w:right w:val="single" w:sz="2" w:space="0" w:color="auto"/>
+            </w:tcBorders>
+            <w:shd w:val="clear" w:color="auto" w:fill="F3F3F3"/>
+            <w:tcMar>
+              <w:top w:w="90" w:type="dxa"/>
+              <w:left w:w="195" w:type="dxa"/>
+              <w:bottom w:w="90" w:type="dxa"/>
+              <w:right w:w="195" w:type="dxa"/>
+            </w:tcMar>
+            <w:hideMark/>
+          </w:tcPr>
+          <w:p>
+            <w:pPr>
+              <w:ind w:left="360"/>
+              <w:rPr>
+                <w:sz w:val="16"/>
+                <w:szCs w:val="16"/>
+                <w:lang w:val="en-GB"/>
+              </w:rPr>
+            </w:pPr>
+            <w:r>
+              <w:rPr>
+                <w:sz w:val="16"/>
+                <w:szCs w:val="16"/>
+                <w:lang w:val="en-GB"/>
+              </w:rPr>
+              <w:t>Ethyl-amine chain, representing the saturated alkyl linkers in the piperazine ring.</w:t>
+            </w:r>
+          </w:p>
+        </w:tc>
+      </w:tr>
+      <w:tr>
+        <w:trPr>
+          <w:trHeight w:val="907"/>
+        </w:trPr>
+        <w:tc>
+          <w:tcPr>
+            <w:tcW w:w="1258" w:type="dxa"/>
+            <w:tcBorders>
+              <w:top w:val="single" w:sz="2" w:space="0" w:color="auto"/>
+              <w:left w:val="single" w:sz="2" w:space="0" w:color="auto"/>
+              <w:bottom w:val="single" w:sz="2" w:space="0" w:color="auto"/>
+              <w:right w:val="single" w:sz="2" w:space="0" w:color="auto"/>
+            </w:tcBorders>
+            <w:shd w:val="clear" w:color="auto" w:fill="F3F3F3"/>
+            <w:tcMar>
+              <w:top w:w="90" w:type="dxa"/>
+              <w:left w:w="195" w:type="dxa"/>
+              <w:bottom w:w="90" w:type="dxa"/>
+              <w:right w:w="195" w:type="dxa"/>
+            </w:tcMar>
+            <w:hideMark/>
+          </w:tcPr>
+          <w:p>
+            <w:pPr>
+              <w:ind w:left="360"/>
+              <w:rPr>
+                <w:sz w:val="16"/>
+                <w:szCs w:val="16"/>
+              </w:rPr>
+            </w:pPr>
+            <w:r>
+              <w:rPr>
+                <w:sz w:val="16"/>
+                <w:szCs w:val="16"/>
+              </w:rPr>
+              <w:t>5</w:t>
+            </w:r>
+          </w:p>
+        </w:tc>
+        <w:tc>
+          <w:tcPr>
+            <w:tcW w:w="2179" w:type="dxa"/>
+            <w:tcBorders>
+              <w:top w:val="single" w:sz="2" w:space="0" w:color="auto"/>
+              <w:left w:val="single" w:sz="2" w:space="0" w:color="auto"/>
+              <w:bottom w:val="single" w:sz="2" w:space="0" w:color="auto"/>
+              <w:right w:val="single" w:sz="2" w:space="0" w:color="auto"/>
+            </w:tcBorders>
+            <w:shd w:val="clear" w:color="auto" w:fill="F3F3F3"/>
+            <w:tcMar>
+              <w:top w:w="90" w:type="dxa"/>
+              <w:left w:w="195" w:type="dxa"/>
+              <w:bottom w:w="90" w:type="dxa"/>
+              <w:right w:w="195" w:type="dxa"/>
+            </w:tcMar>
+            <w:hideMark/>
+          </w:tcPr>
+          <w:p>
+            <w:pPr>
+              <w:ind w:left="360"/>
+              <w:rPr>
+                <w:sz w:val="16"/>
+                <w:szCs w:val="16"/>
+              </w:rPr>
+            </w:pPr>
+            <w:r>
+              <w:rPr>
+                <w:b/>
+                <w:bCs/>
+                <w:sz w:val="16"/>
+                <w:szCs w:val="16"/>
+              </w:rPr>
+              <w:t>cc(N(CC)CC)c</w:t>
+            </w:r>
+          </w:p>
+        </w:tc>
+        <w:tc>
+          <w:tcPr>
+            <w:tcW w:w="1526" w:type="dxa"/>
+            <w:tcBorders>
+              <w:top w:val="single" w:sz="2" w:space="0" w:color="auto"/>
+              <w:left w:val="single" w:sz="2" w:space="0" w:color="auto"/>
+              <w:bottom w:val="single" w:sz="2" w:space="0" w:color="auto"/>
+              <w:right w:val="single" w:sz="2" w:space="0" w:color="auto"/>
+            </w:tcBorders>
+            <w:shd w:val="clear" w:color="auto" w:fill="F3F3F3"/>
+            <w:tcMar>
+              <w:top w:w="90" w:type="dxa"/>
+              <w:left w:w="195" w:type="dxa"/>
+              <w:bottom w:w="90" w:type="dxa"/>
+              <w:right w:w="195" w:type="dxa"/>
+            </w:tcMar>
+            <w:hideMark/>
+          </w:tcPr>
+          <w:p>
+            <w:pPr>
+              <w:ind w:left="360"/>
+              <w:rPr>
+                <w:sz w:val="16"/>
+                <w:szCs w:val="16"/>
+              </w:rPr>
+            </w:pPr>
+            <w:r>
+              <w:rPr>
+                <w:sz w:val="16"/>
+                <w:szCs w:val="16"/>
+              </w:rPr>
+              <w:t>+0.0296</w:t>
+            </w:r>
+          </w:p>
+        </w:tc>
+        <w:tc>
+          <w:tcPr>
+            <w:tcW w:w="1691" w:type="dxa"/>
+            <w:tcBorders>
+              <w:top w:val="single" w:sz="2" w:space="0" w:color="auto"/>
+              <w:left w:val="single" w:sz="2" w:space="0" w:color="auto"/>
+              <w:bottom w:val="single" w:sz="2" w:space="0" w:color="auto"/>
+              <w:right w:val="single" w:sz="2" w:space="0" w:color="auto"/>
+            </w:tcBorders>
+            <w:shd w:val="clear" w:color="auto" w:fill="F3F3F3"/>
+            <w:tcMar>
+              <w:top w:w="90" w:type="dxa"/>
+              <w:left w:w="195" w:type="dxa"/>
+              <w:bottom w:w="90" w:type="dxa"/>
+              <w:right w:w="195" w:type="dxa"/>
+            </w:tcMar>
+            <w:hideMark/>
+          </w:tcPr>
+          <w:p>
+            <w:pPr>
+              <w:ind w:left="360"/>
+              <w:rPr>
+                <w:sz w:val="16"/>
+                <w:szCs w:val="16"/>
+              </w:rPr>
+            </w:pPr>
+            <w:r>
+              <w:rPr>
+                <w:b/>
+                <w:bCs/>
+                <w:sz w:val="16"/>
+                <w:szCs w:val="16"/>
+              </w:rPr>
+              <w:t>Positive</w:t>
+            </w:r>
+          </w:p>
+        </w:tc>
+        <w:tc>
+          <w:tcPr>
+            <w:tcW w:w="2982" w:type="dxa"/>
+            <w:tcBorders>
+              <w:top w:val="single" w:sz="2" w:space="0" w:color="auto"/>
+              <w:left w:val="single" w:sz="2" w:space="0" w:color="auto"/>
+              <w:bottom w:val="single" w:sz="2" w:space="0" w:color="auto"/>
+              <w:right w:val="single" w:sz="2" w:space="0" w:color="auto"/>
+            </w:tcBorders>
+            <w:shd w:val="clear" w:color="auto" w:fill="F3F3F3"/>
+            <w:tcMar>
+              <w:top w:w="90" w:type="dxa"/>
+              <w:left w:w="195" w:type="dxa"/>
+              <w:bottom w:w="90" w:type="dxa"/>
+              <w:right w:w="195" w:type="dxa"/>
+            </w:tcMar>
+            <w:hideMark/>
+          </w:tcPr>
+          <w:p>
+            <w:pPr>
+              <w:ind w:left="360"/>
+              <w:rPr>
+                <w:sz w:val="16"/>
+                <w:szCs w:val="16"/>
+                <w:lang w:val="en-GB"/>
+              </w:rPr>
+            </w:pPr>
+            <w:r>
+              <w:rPr>
+                <w:sz w:val="16"/>
+                <w:szCs w:val="16"/>
+                <w:lang w:val="en-GB"/>
+              </w:rPr>
+              <w:t>Phenyl ring connected to a nitrogen which is part of a piperazine ring (N-phenylpiperazine motif).</w:t>
+            </w:r>
+          </w:p>
+        </w:tc>
+      </w:tr>
+    </w:tbl>
+    <w:p>
+      <w:pPr>
+        <w:ind w:left="360"/>
+        <w:rPr>
+          <w:lang w:val="en-GB"/>
+        </w:rPr>
+      </w:pPr>
+    </w:p>
+    <w:p>
+      <w:pPr>
+        <w:ind w:left="360"/>
+        <w:rPr>
+          <w:lang w:val="en-GB"/>
+        </w:rPr>
+      </w:pPr>
+    </w:p>
+    <w:p>
+      <w:pPr>
+        <w:ind w:left="360"/>
+        <w:rPr>
+          <w:b/>
+          <w:bCs/>
+          <w:lang w:val="en-GB"/>
+        </w:rPr>
+      </w:pPr>
+      <w:r>
+        <w:rPr>
+          <w:b/>
+          <w:bCs/>
+          <w:lang w:val="en-GB"/>
+        </w:rPr>
+        <w:t>Structure Visualization</w:t>
+      </w:r>
+    </w:p>
+    <w:p>
+      <w:pPr>
+        <w:ind w:left="360"/>
+        <w:rPr>
+          <w:lang w:val="en-GB"/>
+        </w:rPr>
+      </w:pPr>
+      <w:r>
+        <w:rPr>
+          <w:lang w:val="en-GB"/>
+        </w:rPr>
+        <w:t xml:space="preserve">Below is the 2D depiction of the compound with SHAP values mapped onto the atoms. </w:t>
+      </w:r>
+      <w:r>
+        <w:rPr>
+          <w:b/>
+          <w:bCs/>
+          <w:lang w:val="en-GB"/>
+        </w:rPr>
+        <w:t>Red</w:t>
+      </w:r>
+      <w:r>
+        <w:rPr>
+          <w:lang w:val="en-GB"/>
+        </w:rPr>
+        <w:t xml:space="preserve"> indicates positive contributions (driving towards activity), and </w:t>
+      </w:r>
+      <w:r>
+        <w:rPr>
+          <w:b/>
+          <w:bCs/>
+          <w:lang w:val="en-GB"/>
+        </w:rPr>
+        <w:t>Blue</w:t>
+      </w:r>
+      <w:r>
+        <w:rPr>
+          <w:lang w:val="en-GB"/>
+        </w:rPr>
+        <w:t xml:space="preserve"> indicates negative contributions.</w:t>
+      </w:r>
+    </w:p>
+    <w:p>
+      <w:pPr>
+        <w:ind w:left="360"/>
+        <w:rPr>
+          <w:lang w:val="en-GB"/>
+        </w:rPr>
+      </w:pPr>
+      <w:r>
+        <w:rPr>
+          <w:noProof/>
+        </w:rPr>
+        <w:drawing>
+          <wp:inline distT="0" distB="0" distL="0" distR="0" wp14:anchorId="77591FC4" wp14:editId="3D82DCBB">
+            <wp:extent cx="3837007" cy="2555306"/>
+            <wp:effectExtent l="0" t="0" r="0" b="0"/>
+            <wp:docPr id="1" name="Picture 1"/>
+            <wp:cNvGraphicFramePr>
+              <a:graphicFrameLocks xmlns:a="http://schemas.openxmlformats.org/drawingml/2006/main" noChangeAspect="1"/>
+            </wp:cNvGraphicFramePr>
+            <a:graphic xmlns:a="http://schemas.openxmlformats.org/drawingml/2006/main">
+              <a:graphicData uri="http://schemas.openxmlformats.org/drawingml/2006/picture">
+                <pic:pic xmlns:pic="http://schemas.openxmlformats.org/drawingml/2006/picture">
+                  <pic:nvPicPr>
+                    <pic:cNvPr id="0" name="Picture 1"/>
+                    <pic:cNvPicPr>
+                      <a:picLocks noChangeAspect="1" noChangeArrowheads="1"/>
+                    </pic:cNvPicPr>
+                  </pic:nvPicPr>
+                  <pic:blipFill>
+                    <a:blip r:embed="rId5">
+                      <a:extLst>
+                        <a:ext uri="{28A0092B-C50C-407E-A947-70E740481C1C}">
+                          <a14:useLocalDpi xmlns:a14="http://schemas.microsoft.com/office/drawing/2010/main" val="0"/>
+                        </a:ext>
+                      </a:extLst>
+                    </a:blip>
+                    <a:srcRect/>
+                    <a:stretch>
+                      <a:fillRect/>
+                    </a:stretch>
+                  </pic:blipFill>
+                  <pic:spPr bwMode="auto">
+                    <a:xfrm>
+                      <a:off x="0" y="0"/>
+                      <a:ext cx="3840388" cy="2557558"/>
+                    </a:xfrm>
+                    <a:prstGeom prst="rect">
+                      <a:avLst/>
+                    </a:prstGeom>
+                    <a:noFill/>
+                    <a:ln>
+                      <a:noFill/>
+                    </a:ln>
+                  </pic:spPr>
+                </pic:pic>
+              </a:graphicData>
+            </a:graphic>
+          </wp:inline>
+        </w:drawing>
+      </w:r>
+    </w:p>
+    <w:p>
+      <w:pPr>
+        <w:ind w:left="360"/>
+        <w:rPr>
+          <w:lang w:val="en-GB"/>
+        </w:rPr>
+      </w:pPr>
+    </w:p>
+    <w:p>
+      <w:pPr>
+        <w:ind w:left="360"/>
+        <w:rPr>
+          <w:lang w:val="en-GB"/>
+        </w:rPr>
+      </w:pPr>
+      <w:r>
+        <w:rPr>
+          <w:lang w:val="en-GB"/>
+        </w:rPr>
+        <w:lastRenderedPageBreak/>
+        <w:t xml:space="preserve">The visualization confirms that the </w:t>
+      </w:r>
+      <w:r>
+        <w:rPr>
+          <w:b/>
+          <w:bCs/>
+          <w:lang w:val="en-GB"/>
+        </w:rPr>
+        <w:t>piperazine ring</w:t>
+      </w:r>
+      <w:r>
+        <w:rPr>
+          <w:lang w:val="en-GB"/>
+        </w:rPr>
+        <w:t xml:space="preserve"> and its attachment points to the aromatic systems are the most "active" regions according to the model.</w:t>
+      </w:r>
+    </w:p>
+    <w:p>
+      <w:pPr>
+        <w:ind w:left="360"/>
+        <w:rPr>
+          <w:b/>
+          <w:bCs/>
+          <w:lang w:val="en-GB"/>
+        </w:rPr>
+      </w:pPr>
+      <w:r>
+        <w:rPr>
+          <w:b/>
+          <w:bCs/>
+          <w:lang w:val="en-GB"/>
+        </w:rPr>
+        <w:t>Top 5 Fragment Environments</w:t>
+      </w:r>
+    </w:p>
+    <w:p>
+      <w:pPr>
+        <w:ind w:left="360"/>
+        <w:rPr>
+          <w:lang w:val="en-GB"/>
+        </w:rPr>
+      </w:pPr>
+      <w:r>
+        <w:rPr>
+          <w:lang w:val="en-GB"/>
+        </w:rPr>
+        <w:t>Here are the specific molecular fragments identified as the top drivers:</w:t>
+      </w:r>
+    </w:p>
+    <w:p>
+      <w:pPr>
+        <w:ind w:left="360"/>
+        <w:rPr>
+          <w:lang w:val="en-GB"/>
+        </w:rPr>
+      </w:pPr>
+      <w:r>
+        <w:rPr>
+          <w:noProof/>
+        </w:rPr>
+        <w:drawing>
+          <wp:inline distT="0" distB="0" distL="0" distR="0" wp14:anchorId="16012E75" wp14:editId="5C098E03">
+            <wp:extent cx="5760720" cy="2159635"/>
+            <wp:effectExtent l="0" t="0" r="0" b="0"/>
+            <wp:docPr id="2" name="Picture 2"/>
+            <wp:cNvGraphicFramePr>
+              <a:graphicFrameLocks xmlns:a="http://schemas.openxmlformats.org/drawingml/2006/main" noChangeAspect="1"/>
+            </wp:cNvGraphicFramePr>
+            <a:graphic xmlns:a="http://schemas.openxmlformats.org/drawingml/2006/main">
+              <a:graphicData uri="http://schemas.openxmlformats.org/drawingml/2006/picture">
+                <pic:pic xmlns:pic="http://schemas.openxmlformats.org/drawingml/2006/picture">
+                  <pic:nvPicPr>
+                    <pic:cNvPr id="0" name="Picture 3"/>
+                    <pic:cNvPicPr>
+                      <a:picLocks noChangeAspect="1" noChangeArrowheads="1"/>
+                    </pic:cNvPicPr>
+                  </pic:nvPicPr>
+                  <pic:blipFill>
+                    <a:blip r:embed="rId6">
+                      <a:extLst>
+                        <a:ext uri="{28A0092B-C50C-407E-A947-70E740481C1C}">
+                          <a14:useLocalDpi xmlns:a14="http://schemas.microsoft.com/office/drawing/2010/main" val="0"/>
+                        </a:ext>
+                      </a:extLst>
+                    </a:blip>
+                    <a:srcRect/>
+                    <a:stretch>
+                      <a:fillRect/>
+                    </a:stretch>
+                  </pic:blipFill>
+                  <pic:spPr bwMode="auto">
+                    <a:xfrm>
+                      <a:off x="0" y="0"/>
+                      <a:ext cx="5760720" cy="2159635"/>
+                    </a:xfrm>
+                    <a:prstGeom prst="rect">
+                      <a:avLst/>
+                    </a:prstGeom>
+                    <a:noFill/>
+                    <a:ln>
+                      <a:noFill/>
+                    </a:ln>
+                  </pic:spPr>
+                </pic:pic>
+              </a:graphicData>
+            </a:graphic>
+          </wp:inline>
+        </w:drawing>
+      </w:r>
+    </w:p>
+    <w:p>
+      <w:pPr>
+        <w:ind w:left="360"/>
+        <w:rPr>
+          <w:lang w:val="en-GB"/>
+        </w:rPr>
+      </w:pPr>
+    </w:p>
+    <w:p>
+      <w:pPr>
+        <w:ind w:left="360"/>
+        <w:rPr>
+          <w:b/>
+          <w:bCs/>
+          <w:lang w:val="en-GB"/>
+        </w:rPr>
+      </w:pPr>
+      <w:r>
+        <w:rPr>
+          <w:b/>
+          <w:bCs/>
+          <w:lang w:val="en-GB"/>
+        </w:rPr>
+        <w:t>Rationalization</w:t>
+      </w:r>
+    </w:p>
+    <w:p>
+      <w:pPr>
+        <w:ind w:left="360"/>
+      </w:pPr>
+      <w:r>
+        <w:rPr>
+          <w:lang w:val="en-GB"/>
+        </w:rPr>
+        <w:t xml:space="preserve">The SHAP analysis highlights the </w:t>
+      </w:r>
+      <w:r>
+        <w:rPr>
+          <w:b/>
+          <w:bCs/>
+          <w:lang w:val="en-GB"/>
+        </w:rPr>
+        <w:t>piperazine moiety</w:t>
+      </w:r>
+      <w:r>
+        <w:rPr>
+          <w:lang w:val="en-GB"/>
+        </w:rPr>
+        <w:t xml:space="preserve"> as the central pharmacophore driving the predicted activity. </w:t>
+      </w:r>
+      <w:r>
+        <w:t>Here is the chemical reasoning:</w:t>
+      </w:r>
+    </w:p>
+    <w:p>
+      <w:pPr>
+        <w:numPr>
+          <w:ilvl w:val="0"/>
+          <w:numId w:val="8"/>
+        </w:numPr>
+        <w:rPr>
+          <w:lang w:val="en-GB"/>
+        </w:rPr>
+      </w:pPr>
+      <w:r>
+        <w:rPr>
+          <w:b/>
+          <w:bCs/>
+          <w:lang w:val="en-GB"/>
+        </w:rPr>
+        <w:t>Piperazine as a Linker/Anchor</w:t>
+      </w:r>
+      <w:r>
+        <w:rPr>
+          <w:lang w:val="en-GB"/>
+        </w:rPr>
+        <w:t>: The top 5 fragments are all variations of the piperazine ring (N2CCN(...)). In medicinal chemistry, piperazine is a ubiquitous scaffold used to link two distinct hydrophobic domains (here, the dichlorophenyl group and the indole-like system). Its ability to act as both a hydrogen bond acceptor (via ring nitrogens) and a hydrophobic spacer makes it a high-value feature for binding to many protein targets.</w:t>
+      </w:r>
+    </w:p>
+    <w:p>
+      <w:pPr>
+        <w:numPr>
+          <w:ilvl w:val="0"/>
+          <w:numId w:val="8"/>
+        </w:numPr>
+        <w:rPr>
+          <w:lang w:val="en-GB"/>
+        </w:rPr>
+      </w:pPr>
+      <w:r>
+        <w:rPr>
+          <w:b/>
+          <w:bCs/>
+          <w:lang w:val="en-GB"/>
+        </w:rPr>
+        <w:t>N-phenylpiperazine Motif</w:t>
+      </w:r>
+      <w:r>
+        <w:rPr>
+          <w:lang w:val="en-GB"/>
+        </w:rPr>
+        <w:t>: Fragment #5 (cc(N(CC)CC)c) represents the classic </w:t>
+      </w:r>
+      <w:r>
+        <w:rPr>
+          <w:i/>
+          <w:iCs/>
+          <w:lang w:val="en-GB"/>
+        </w:rPr>
+        <w:t>N</w:t>
+      </w:r>
+      <w:r>
+        <w:rPr>
+          <w:lang w:val="en-GB"/>
+        </w:rPr>
+        <w:t>-phenylpiperazine structure. This motif is known to interact with various receptors (e.g., serotonin, dopamine, adrenergic receptors) via cation-</w:t>
+      </w:r>
+      <w:r>
+        <w:t>π</w:t>
+      </w:r>
+      <w:r>
+        <w:rPr>
+          <w:lang w:val="en-GB"/>
+        </w:rPr>
+        <w:t xml:space="preserve"> interactions or hydrogen bonding. The positive SHAP value suggests the model has learned that the presence of a phenyl ring attached to a piperazine nitrogen is a strong predictor of activity against P14416.</w:t>
+      </w:r>
+    </w:p>
+    <w:p>
+      <w:pPr>
+        <w:numPr>
+          <w:ilvl w:val="0"/>
+          <w:numId w:val="8"/>
+        </w:numPr>
+        <w:rPr>
+          <w:lang w:val="en-GB"/>
+        </w:rPr>
+      </w:pPr>
+      <w:r>
+        <w:rPr>
+          <w:b/>
+          <w:bCs/>
+          <w:lang w:val="en-GB"/>
+        </w:rPr>
+        <w:t>Alkyl Linkers</w:t>
+      </w:r>
+      <w:r>
+        <w:rPr>
+          <w:lang w:val="en-GB"/>
+        </w:rPr>
+        <w:t>: Fragments #1 and #4 (cN(C)CCN and CCN) emphasize the importance of the saturated carbon chain (CC) connecting the nitrogens. This length and flexibility allow the molecule to span specific hydrophobic pockets in the target protein.</w:t>
+      </w:r>
+    </w:p>
+    <w:p>
+      <w:pPr>
+        <w:numPr>
+          <w:ilvl w:val="0"/>
+          <w:numId w:val="8"/>
+        </w:numPr>
+        <w:rPr>
+          <w:lang w:val="en-GB"/>
+        </w:rPr>
+      </w:pPr>
+      <w:r>
+        <w:rPr>
+          <w:b/>
+          <w:bCs/>
+          <w:lang w:val="en-GB"/>
+        </w:rPr>
+        <w:t>Tertiary Amine Character</w:t>
+      </w:r>
+      <w:r>
+        <w:rPr>
+          <w:lang w:val="en-GB"/>
+        </w:rPr>
+        <w:t xml:space="preserve">: Fragment #2 (CN(C)C) highlights the tertiary amine nature of the piperazine nitrogens. The model likely relies on the basicity or </w:t>
+      </w:r>
+      <w:r>
+        <w:rPr>
+          <w:lang w:val="en-GB"/>
+        </w:rPr>
+        <w:lastRenderedPageBreak/>
+        <w:t>specific steric bulk of these nitrogens to differentiate active from inactive compounds.</w:t>
+      </w:r>
+    </w:p>
+    <w:p>
+      <w:pPr>
+        <w:ind w:left="360"/>
+        <w:rPr>
+          <w:lang w:val="en-GB"/>
+        </w:rPr>
+      </w:pPr>
+      <w:r>
+        <w:rPr>
+          <w:lang w:val="en-GB"/>
+        </w:rPr>
+        <w:t xml:space="preserve">In summary, the model identifies the </w:t>
+      </w:r>
+      <w:r>
+        <w:rPr>
+          <w:b/>
+          <w:bCs/>
+          <w:lang w:val="en-GB"/>
+        </w:rPr>
+        <w:t>N-phenylpiperazine</w:t>
+      </w:r>
+      <w:r>
+        <w:rPr>
+          <w:lang w:val="en-GB"/>
+        </w:rPr>
+        <w:t xml:space="preserve"> core as the critical "active" substructure, with the dichlorophenyl and indole-like tails providing necessary hydrophobic bulk that complements this central scaffold.</w:t>
+      </w:r>
+    </w:p>
+    <w:p>
+      <w:pPr>
+        <w:ind w:left="360"/>
+        <w:rPr>
+          <w:lang w:val="en-GB"/>
+        </w:rPr>
+      </w:pPr>
+    </w:p>
+    <w:p>
+      <w:pPr>
+        <w:ind w:left="360"/>
+        <w:rPr>
+          <w:lang w:val="en-GB"/>
+        </w:rPr>
+      </w:pPr>
+    </w:p>
+    <w:p>
+      <w:pPr>
+        <w:ind w:left="360"/>
+        <w:rPr>
+          <w:b/>
+          <w:bCs/>
+          <w:lang w:val="en-GB"/>
+        </w:rPr>
+      </w:pPr>
+      <w:r>
+        <w:rPr>
+          <w:b/>
+          <w:bCs/>
+          <w:lang w:val="en-GB"/>
+        </w:rPr>
+        <w:t>MOLAnchor</w:t>
+      </w:r>
+    </w:p>
+    <w:p>
+      <w:pPr>
+        <w:ind w:left="360"/>
+        <w:rPr>
+          <w:lang w:val="en-GB"/>
+        </w:rPr>
+      </w:pPr>
+      <w:r>
+        <w:rPr>
+          <w:lang w:val="en-GB"/>
+        </w:rPr>
+        <w:t>Perform the following steps in order:</w:t>
+      </w:r>
+    </w:p>
+    <w:p>
+      <w:pPr>
+        <w:numPr>
+          <w:ilvl w:val="0"/>
+          <w:numId w:val="7"/>
+        </w:numPr>
+        <w:rPr>
+          <w:lang w:val="en-GB"/>
+        </w:rPr>
+      </w:pPr>
+      <w:r>
+        <w:rPr>
+          <w:b/>
+          <w:bCs/>
+          <w:lang w:val="en-GB"/>
+        </w:rPr>
+        <w:t>MOLANCHOR</w:t>
+      </w:r>
+      <w:r>
+        <w:rPr>
+          <w:b/>
+          <w:bCs/>
+          <w:lang w:val="en-GB"/>
+        </w:rPr>
+        <w:t>-based explanation</w:t>
+      </w:r>
+      <w:r>
+        <w:rPr>
+          <w:lang w:val="en-GB"/>
+        </w:rPr>
+        <w:t xml:space="preserve"> — </w:t>
+      </w:r>
+      <w:r>
+        <w:rPr>
+          <w:lang w:val="en-GB"/>
+        </w:rPr>
+        <w:t>For this</w:t>
+      </w:r>
+      <w:r>
+        <w:rPr>
+          <w:lang w:val="en-GB"/>
+        </w:rPr>
+        <w:t xml:space="preserve"> model, compute </w:t>
+      </w:r>
+      <w:r>
+        <w:rPr>
+          <w:b/>
+          <w:bCs/>
+          <w:lang w:val="en-GB"/>
+        </w:rPr>
+        <w:t>MOLANCHOR</w:t>
+      </w:r>
+      <w:r>
+        <w:rPr>
+          <w:lang w:val="en-GB"/>
+        </w:rPr>
+        <w:t xml:space="preserve"> </w:t>
+      </w:r>
+      <w:r>
+        <w:rPr>
+          <w:lang w:val="en-GB"/>
+        </w:rPr>
+        <w:t xml:space="preserve">for this compound. </w:t>
+      </w:r>
+    </w:p>
+    <w:p>
+      <w:pPr>
+        <w:numPr>
+          <w:ilvl w:val="0"/>
+          <w:numId w:val="7"/>
+        </w:numPr>
+        <w:rPr>
+          <w:lang w:val="en-GB"/>
+        </w:rPr>
+      </w:pPr>
+      <w:r>
+        <w:rPr>
+          <w:b/>
+          <w:bCs/>
+          <w:lang w:val="en-GB"/>
+        </w:rPr>
+        <w:t>Structure visualization</w:t>
+      </w:r>
+      <w:r>
+        <w:rPr>
+          <w:lang w:val="en-GB"/>
+        </w:rPr>
+        <w:t xml:space="preserve"> — Generate a 2D depiction of the compound </w:t>
+      </w:r>
+      <w:r>
+        <w:rPr>
+          <w:b/>
+          <w:bCs/>
+          <w:lang w:val="en-GB"/>
+        </w:rPr>
+        <w:t>ANCHOR</w:t>
+      </w:r>
+      <w:r>
+        <w:rPr>
+          <w:lang w:val="en-GB"/>
+        </w:rPr>
+        <w:t xml:space="preserve"> </w:t>
+      </w:r>
+      <w:r>
+        <w:rPr>
+          <w:lang w:val="en-GB"/>
+        </w:rPr>
+        <w:t xml:space="preserve">mapped onto the structure. </w:t>
+      </w:r>
+    </w:p>
+    <w:p>
+      <w:pPr>
+        <w:numPr>
+          <w:ilvl w:val="0"/>
+          <w:numId w:val="7"/>
+        </w:numPr>
+        <w:rPr>
+          <w:lang w:val="en-GB"/>
+        </w:rPr>
+      </w:pPr>
+      <w:r>
+        <w:rPr>
+          <w:b/>
+          <w:bCs/>
+          <w:lang w:val="en-GB"/>
+        </w:rPr>
+        <w:t>Rationalization</w:t>
+      </w:r>
+      <w:r>
+        <w:rPr>
+          <w:lang w:val="en-GB"/>
+        </w:rPr>
+        <w:t xml:space="preserve"> — Provide a chemically grounded explanation </w:t>
+      </w:r>
+      <w:r>
+        <w:rPr>
+          <w:lang w:val="en-GB"/>
+        </w:rPr>
+        <w:t>for the anchor.</w:t>
+      </w:r>
+      <w:r>
+        <w:rPr>
+          <w:lang w:val="en-GB"/>
+        </w:rPr>
+        <w:t xml:space="preserve"> Ground your reasoning in known structure–activity or physicochemical relationships where possible.</w:t>
+      </w:r>
+    </w:p>
+    <w:p>
+      <w:pPr>
+        <w:ind w:left="720"/>
+        <w:rPr>
+          <w:lang w:val="en-GB"/>
+        </w:rPr>
+      </w:pPr>
+    </w:p>
+    <w:p>
+      <w:pPr>
+        <w:ind w:left="360"/>
+        <w:rPr>
+          <w:b/>
+          <w:bCs/>
+          <w:lang w:val="en-GB"/>
+        </w:rPr>
+      </w:pPr>
+      <w:r>
+        <w:rPr>
+          <w:b/>
+          <w:bCs/>
+          <w:lang w:val="en-GB"/>
+        </w:rPr>
+        <w:t>MolAnchor-based Explanation</w:t>
+      </w:r>
+    </w:p>
+    <w:p>
+      <w:pPr>
+        <w:ind w:left="360"/>
+        <w:rPr>
+          <w:lang w:val="en-GB"/>
+        </w:rPr>
+      </w:pPr>
+      <w:r>
+        <w:rPr>
+          <w:lang w:val="en-GB"/>
+        </w:rPr>
+        <w:t>The MolAnchor analysis identified a single, high-precision anchor driving the model's prediction for this compound:</w:t>
+      </w:r>
+    </w:p>
+    <w:p>
+      <w:pPr>
+        <w:numPr>
+          <w:ilvl w:val="0"/>
+          <w:numId w:val="9"/>
+        </w:numPr>
+        <w:rPr>
+          <w:lang w:val="en-GB"/>
+        </w:rPr>
+      </w:pPr>
+      <w:r>
+        <w:rPr>
+          <w:b/>
+          <w:bCs/>
+          <w:lang w:val="en-GB"/>
+        </w:rPr>
+        <w:t>Anchor Fragment</w:t>
+      </w:r>
+      <w:r>
+        <w:rPr>
+          <w:lang w:val="en-GB"/>
+        </w:rPr>
+        <w:t>: [*]N1CCN([*])CC1 (The piperazine ring)</w:t>
+      </w:r>
+    </w:p>
+    <w:p>
+      <w:pPr>
+        <w:numPr>
+          <w:ilvl w:val="0"/>
+          <w:numId w:val="9"/>
+        </w:numPr>
+        <w:rPr>
+          <w:lang w:val="en-GB"/>
+        </w:rPr>
+      </w:pPr>
+      <w:r>
+        <w:rPr>
+          <w:b/>
+          <w:bCs/>
+          <w:lang w:val="en-GB"/>
+        </w:rPr>
+        <w:t>Precision</w:t>
+      </w:r>
+      <w:r>
+        <w:rPr>
+          <w:lang w:val="en-GB"/>
+        </w:rPr>
+        <w:t>: 1.0 (100% certain that this fragment alone is sufficient to predict the target class)</w:t>
+      </w:r>
+    </w:p>
+    <w:p>
+      <w:pPr>
+        <w:numPr>
+          <w:ilvl w:val="0"/>
+          <w:numId w:val="9"/>
+        </w:numPr>
+        <w:rPr>
+          <w:lang w:val="en-GB"/>
+        </w:rPr>
+      </w:pPr>
+      <w:r>
+        <w:rPr>
+          <w:b/>
+          <w:bCs/>
+          <w:lang w:val="en-GB"/>
+        </w:rPr>
+        <w:t>Coverage</w:t>
+      </w:r>
+      <w:r>
+        <w:rPr>
+          <w:lang w:val="en-GB"/>
+        </w:rPr>
+        <w:t>: 0.52 (Explains 52% of the model's decision for this specific molecule)</w:t>
+      </w:r>
+    </w:p>
+    <w:p>
+      <w:pPr>
+        <w:ind w:left="360"/>
+        <w:rPr>
+          <w:lang w:val="en-GB"/>
+        </w:rPr>
+      </w:pPr>
+      <w:r>
+        <w:rPr>
+          <w:lang w:val="en-GB"/>
+        </w:rPr>
+        <w:t xml:space="preserve">This indicates that the </w:t>
+      </w:r>
+      <w:r>
+        <w:rPr>
+          <w:b/>
+          <w:bCs/>
+          <w:lang w:val="en-GB"/>
+        </w:rPr>
+        <w:t>piperazine core</w:t>
+      </w:r>
+      <w:r>
+        <w:rPr>
+          <w:lang w:val="en-GB"/>
+        </w:rPr>
+        <w:t xml:space="preserve"> is the critical "active" pharmacophore. The model relies on this scaffold to classify the compound as active (Class 1).</w:t>
+      </w:r>
+    </w:p>
+    <w:p>
+      <w:pPr>
+        <w:ind w:left="360"/>
+        <w:rPr>
+          <w:lang w:val="en-GB"/>
+        </w:rPr>
+      </w:pPr>
+    </w:p>
+    <w:p>
+      <w:pPr>
+        <w:ind w:left="360"/>
+        <w:rPr>
+          <w:lang w:val="en-GB"/>
+        </w:rPr>
+      </w:pPr>
+    </w:p>
+    <w:p>
+      <w:pPr>
+        <w:ind w:left="360"/>
+        <w:rPr>
+          <w:lang w:val="en-GB"/>
+        </w:rPr>
+      </w:pPr>
+    </w:p>
+    <w:p>
+      <w:pPr>
+        <w:ind w:left="360"/>
+        <w:rPr>
+          <w:lang w:val="en-GB"/>
+        </w:rPr>
+      </w:pPr>
+    </w:p>
+    <w:p>
+      <w:pPr>
+        <w:ind w:left="360"/>
+        <w:rPr>
+          <w:lang w:val="en-GB"/>
+        </w:rPr>
+      </w:pPr>
+    </w:p>
+    <w:p>
+      <w:pPr>
+        <w:ind w:left="360"/>
+        <w:rPr>
+          <w:lang w:val="en-GB"/>
+        </w:rPr>
+      </w:pPr>
+    </w:p>
+    <w:p>
+      <w:pPr>
+        <w:ind w:left="360"/>
+        <w:rPr>
+          <w:b/>
+          <w:bCs/>
+          <w:lang w:val="en-GB"/>
+        </w:rPr>
+      </w:pPr>
+      <w:r>
+        <w:rPr>
+          <w:b/>
+          <w:bCs/>
+          <w:lang w:val="en-GB"/>
+        </w:rPr>
+        <w:lastRenderedPageBreak/>
+        <w:t>Structure Visualization</w:t>
+      </w:r>
+    </w:p>
+    <w:p>
+      <w:pPr>
+        <w:ind w:left="360"/>
+        <w:rPr>
+          <w:lang w:val="en-GB"/>
+        </w:rPr>
+      </w:pPr>
+      <w:r>
+        <w:rPr>
+          <w:lang w:val="en-GB"/>
+        </w:rPr>
+        <w:t>Below is the 2D depiction of the compound with the identified anchor highlighted. The piperazine ring is marked as the decisive structural feature for the prediction.</w:t>
+      </w:r>
+    </w:p>
+    <w:p>
+      <w:pPr>
+        <w:ind w:left="360"/>
+        <w:rPr>
+          <w:lang w:val="en-GB"/>
+        </w:rPr>
+      </w:pPr>
+      <w:r>
+        <w:rPr>
+          <w:noProof/>
+        </w:rPr>
+        <w:drawing>
+          <wp:inline distT="0" distB="0" distL="0" distR="0" wp14:anchorId="7543B501" wp14:editId="5B5C557E">
+            <wp:extent cx="3148314" cy="3148314"/>
+            <wp:effectExtent l="0" t="0" r="0" b="0"/>
+            <wp:docPr id="3" name="Picture 3"/>
+            <wp:cNvGraphicFramePr>
+              <a:graphicFrameLocks xmlns:a="http://schemas.openxmlformats.org/drawingml/2006/main" noChangeAspect="1"/>
+            </wp:cNvGraphicFramePr>
+            <a:graphic xmlns:a="http://schemas.openxmlformats.org/drawingml/2006/main">
+              <a:graphicData uri="http://schemas.openxmlformats.org/drawingml/2006/picture">
+                <pic:pic xmlns:pic="http://schemas.openxmlformats.org/drawingml/2006/picture">
+                  <pic:nvPicPr>
+                    <pic:cNvPr id="0" name="Picture 5"/>
+                    <pic:cNvPicPr>
+                      <a:picLocks noChangeAspect="1" noChangeArrowheads="1"/>
+                    </pic:cNvPicPr>
+                  </pic:nvPicPr>
+                  <pic:blipFill>
+                    <a:blip r:embed="rId7">
+                      <a:extLst>
+                        <a:ext uri="{28A0092B-C50C-407E-A947-70E740481C1C}">
+                          <a14:useLocalDpi xmlns:a14="http://schemas.microsoft.com/office/drawing/2010/main" val="0"/>
+                        </a:ext>
+                      </a:extLst>
+                    </a:blip>
+                    <a:srcRect/>
+                    <a:stretch>
+                      <a:fillRect/>
+                    </a:stretch>
+                  </pic:blipFill>
+                  <pic:spPr bwMode="auto">
+                    <a:xfrm>
+                      <a:off x="0" y="0"/>
+                      <a:ext cx="3152426" cy="3152426"/>
+                    </a:xfrm>
+                    <a:prstGeom prst="rect">
+                      <a:avLst/>
+                    </a:prstGeom>
+                    <a:noFill/>
+                    <a:ln>
+                      <a:noFill/>
+                    </a:ln>
+                  </pic:spPr>
+                </pic:pic>
+              </a:graphicData>
+            </a:graphic>
+          </wp:inline>
+        </w:drawing>
+      </w:r>
+    </w:p>
+    <w:p>
+      <w:pPr>
+        <w:ind w:left="360"/>
+        <w:rPr>
+          <w:lang w:val="en-GB"/>
+        </w:rPr>
+      </w:pPr>
+    </w:p>
+    <w:p>
+      <w:pPr>
+        <w:ind w:left="360"/>
+        <w:rPr>
+          <w:b/>
+          <w:bCs/>
+        </w:rPr>
+      </w:pPr>
+      <w:r>
+        <w:rPr>
+          <w:b/>
+          <w:bCs/>
+        </w:rPr>
+        <w:t>Rationalization</w:t>
+      </w:r>
+    </w:p>
+    <w:p>
+      <w:pPr>
+        <w:ind w:left="360"/>
+      </w:pPr>
+      <w:r>
+        <w:t xml:space="preserve">The identification of the </w:t>
+      </w:r>
+      <w:r>
+        <w:rPr>
+          <w:b/>
+          <w:bCs/>
+        </w:rPr>
+        <w:t>piperazine ring</w:t>
+      </w:r>
+      <w:r>
+        <w:t xml:space="preserve"> (N1CCN1) as the sole high-precision anchor is chemically sound and aligns with established structure–activity relationships (SAR) in medicinal chemistry:</w:t>
+      </w:r>
+    </w:p>
+    <w:p>
+      <w:pPr>
+        <w:numPr>
+          <w:ilvl w:val="0"/>
+          <w:numId w:val="10"/>
+        </w:numPr>
+      </w:pPr>
+      <w:r>
+        <w:rPr>
+          <w:b/>
+          <w:bCs/>
+        </w:rPr>
+        <w:t>Privileged Scaffold</w:t>
+      </w:r>
+      <w:r>
+        <w:t>: Piperazine is a well-known "privileged scaffold" in drug discovery. It is frequently found in bioactive molecules because its two nitrogen atoms provide versatile hydrogen bonding capabilities (both as donors and acceptors) and its rigid chair conformation positions substituents at optimal distances for binding to protein pockets.</w:t>
+      </w:r>
+    </w:p>
+    <w:p>
+      <w:pPr>
+        <w:numPr>
+          <w:ilvl w:val="0"/>
+          <w:numId w:val="10"/>
+        </w:numPr>
+      </w:pPr>
+      <w:r>
+        <w:rPr>
+          <w:b/>
+          <w:bCs/>
+        </w:rPr>
+        <w:t>Linker Function</w:t>
+      </w:r>
+      <w:r>
+        <w:t>: In this molecule, the piperazine acts as a central linker connecting two distinct hydrophobic domains: the dichlorophenyl group and the methoxy-indole moiety. This "hydrophobic–linker–hydrophobic" motif is common in ligands targeting G-protein coupled receptors (GPCRs) or kinases, where the linker spans a specific region of the binding site while the aromatic caps anchor into hydrophobic pockets.</w:t>
+      </w:r>
+    </w:p>
+    <w:p>
+      <w:pPr>
+        <w:numPr>
+          <w:ilvl w:val="0"/>
+          <w:numId w:val="10"/>
+        </w:numPr>
+      </w:pPr>
+      <w:r>
+        <w:rPr>
+          <w:b/>
+          <w:bCs/>
+        </w:rPr>
+        <w:t>Electronic Properties</w:t>
+      </w:r>
+      <w:r>
+        <w:t xml:space="preserve">: The nitrogen atoms in the piperazine ring are basic (pKa ~9–10) and can form salt bridges with acidic residues (e.g., aspartate or glutamate) often found in transmembrane domains or enzyme active sites. The </w:t>
+      </w:r>
+      <w:r>
+        <w:lastRenderedPageBreak/>
+        <w:t>model likely learned that the presence of this basic, electron-rich center is a strong predictor of affinity for the P14416 target.</w:t>
+      </w:r>
+    </w:p>
+    <w:p>
+      <w:pPr>
+        <w:numPr>
+          <w:ilvl w:val="0"/>
+          <w:numId w:val="10"/>
+        </w:numPr>
+      </w:pPr>
+      <w:r>
+        <w:rPr>
+          <w:b/>
+          <w:bCs/>
+        </w:rPr>
+        <w:t>Structural Rigidity vs. Flexibility</w:t>
+      </w:r>
+      <w:r>
+        <w:t>: While the piperazine ring itself is relatively rigid, its attachment to the phenyl and indole systems allows for conformational adjustment. This balance of rigidity (for entropic favorability) and flexibility (for induced fit) is a key feature the model has associated with high activity.</w:t>
+      </w:r>
+    </w:p>
+    <w:p>
+      <w:pPr>
+        <w:ind w:left="360"/>
+      </w:pPr>
+      <w:r>
+        <w:t xml:space="preserve">In summary, the MolAnchor result confirms that the </w:t>
+      </w:r>
+      <w:r>
+        <w:rPr>
+          <w:b/>
+          <w:bCs/>
+        </w:rPr>
+        <w:t>piperazine core</w:t>
+      </w:r>
+      <w:r>
+        <w:t xml:space="preserve"> is the non-negotiable "active" element of this molecule. Without this specific scaffold, the model would likely not classify the compound as active, regardless of the attached aromatic tails.</w:t>
+      </w:r>
+    </w:p>
+    <w:p>
+      <w:pPr>
+        <w:ind w:left="360"/>
+        <w:rPr>
+          <w:lang w:val="en-GB"/>
+        </w:rPr>
+      </w:pPr>
     </w:p>
     <w:sectPr>
       <w:pgSz w:w="11906" w:h="16838"/>
@@ -4114,6 +6416,119 @@
     </w:lvl>
   </w:abstractNum>
   <w:abstractNum w:abstractNumId="1" w15:restartNumberingAfterBreak="0">
+    <w:nsid w:val="1E3B6499"/>
+    <w:multiLevelType w:val="multilevel"/>
+    <w:tmpl w:val="01E89DBE"/>
+    <w:lvl w:ilvl="0">
+      <w:start w:val="1"/>
+      <w:numFmt w:val="decimal"/>
+      <w:lvlText w:val="%1."/>
+      <w:lvlJc w:val="left"/>
+      <w:pPr>
+        <w:tabs>
+          <w:tab w:val="num" w:pos="720"/>
+        </w:tabs>
+        <w:ind w:left="720" w:hanging="360"/>
+      </w:pPr>
+    </w:lvl>
+    <w:lvl w:ilvl="1" w:tentative="1">
+      <w:start w:val="1"/>
+      <w:numFmt w:val="decimal"/>
+      <w:lvlText w:val="%2."/>
+      <w:lvlJc w:val="left"/>
+      <w:pPr>
+        <w:tabs>
+          <w:tab w:val="num" w:pos="1440"/>
+        </w:tabs>
+        <w:ind w:left="1440" w:hanging="360"/>
+      </w:pPr>
+    </w:lvl>
+    <w:lvl w:ilvl="2" w:tentative="1">
+      <w:start w:val="1"/>
+      <w:numFmt w:val="decimal"/>
+      <w:lvlText w:val="%3."/>
+      <w:lvlJc w:val="left"/>
+      <w:pPr>
+        <w:tabs>
+          <w:tab w:val="num" w:pos="2160"/>
+        </w:tabs>
+        <w:ind w:left="2160" w:hanging="360"/>
+      </w:pPr>
+    </w:lvl>
+    <w:lvl w:ilvl="3" w:tentative="1">
+      <w:start w:val="1"/>
+      <w:numFmt w:val="decimal"/>
+      <w:lvlText w:val="%4."/>
+      <w:lvlJc w:val="left"/>
+      <w:pPr>
+        <w:tabs>
+          <w:tab w:val="num" w:pos="2880"/>
+        </w:tabs>
+        <w:ind w:left="2880" w:hanging="360"/>
+      </w:pPr>
+    </w:lvl>
+    <w:lvl w:ilvl="4" w:tentative="1">
+      <w:start w:val="1"/>
+      <w:numFmt w:val="decimal"/>
+      <w:lvlText w:val="%5."/>
+      <w:lvlJc w:val="left"/>
+      <w:pPr>
+        <w:tabs>
+          <w:tab w:val="num" w:pos="3600"/>
+        </w:tabs>
+        <w:ind w:left="3600" w:hanging="360"/>
+      </w:pPr>
+    </w:lvl>
+    <w:lvl w:ilvl="5" w:tentative="1">
+      <w:start w:val="1"/>
+      <w:numFmt w:val="decimal"/>
+      <w:lvlText w:val="%6."/>
+      <w:lvlJc w:val="left"/>
+      <w:pPr>
+        <w:tabs>
+          <w:tab w:val="num" w:pos="4320"/>
+        </w:tabs>
+        <w:ind w:left="4320" w:hanging="360"/>
+      </w:pPr>
+    </w:lvl>
+    <w:lvl w:ilvl="6" w:tentative="1">
+      <w:start w:val="1"/>
+      <w:numFmt w:val="decimal"/>
+      <w:lvlText w:val="%7."/>
+      <w:lvlJc w:val="left"/>
+      <w:pPr>
+        <w:tabs>
+          <w:tab w:val="num" w:pos="5040"/>
+        </w:tabs>
+        <w:ind w:left="5040" w:hanging="360"/>
+      </w:pPr>
+    </w:lvl>
+    <w:lvl w:ilvl="7" w:tentative="1">
+      <w:start w:val="1"/>
+      <w:numFmt w:val="decimal"/>
+      <w:lvlText w:val="%8."/>
+      <w:lvlJc w:val="left"/>
+      <w:pPr>
+        <w:tabs>
+          <w:tab w:val="num" w:pos="5760"/>
+        </w:tabs>
+        <w:ind w:left="5760" w:hanging="360"/>
+      </w:pPr>
+    </w:lvl>
+    <w:lvl w:ilvl="8" w:tentative="1">
+      <w:start w:val="1"/>
+      <w:numFmt w:val="decimal"/>
+      <w:lvlText w:val="%9."/>
+      <w:lvlJc w:val="left"/>
+      <w:pPr>
+        <w:tabs>
+          <w:tab w:val="num" w:pos="6480"/>
+        </w:tabs>
+        <w:ind w:left="6480" w:hanging="360"/>
+      </w:pPr>
+    </w:lvl>
+  </w:abstractNum>
+  <w:abstractNum w:abstractNumId="2" w15:restartNumberingAfterBreak="0">
     <w:nsid w:val="33452952"/>
     <w:multiLevelType w:val="multilevel"/>
     <w:tmpl w:val="F59C1E3A"/>
@@ -4262,7 +6677,119 @@
       </w:rPr>
     </w:lvl>
   </w:abstractNum>
-  <w:abstractNum w:abstractNumId="2" w15:restartNumberingAfterBreak="0">
+  <w:abstractNum w:abstractNumId="3" w15:restartNumberingAfterBreak="0">
+    <w:nsid w:val="45ED486F"/>
+    <w:multiLevelType w:val="hybridMultilevel"/>
+    <w:tmpl w:val="85BE304E"/>
+    <w:lvl w:ilvl="0" w:tplc="EB722FF0">
+      <w:numFmt w:val="bullet"/>
+      <w:lvlText w:val="-"/>
+      <w:lvlJc w:val="left"/>
+      <w:pPr>
+        <w:ind w:left="720" w:hanging="360"/>
+      </w:pPr>
+      <w:rPr>
+        <w:rFonts w:ascii="Aptos" w:eastAsiaTheme="minorHAnsi" w:hAnsi="Aptos" w:cstheme="minorBidi" w:hint="default"/>
+      </w:rPr>
+    </w:lvl>
+    <w:lvl w:ilvl="1" w:tplc="04070003" w:tentative="1">
+      <w:start w:val="1"/>
+      <w:numFmt w:val="bullet"/>
+      <w:lvlText w:val="o"/>
+      <w:lvlJc w:val="left"/>
+      <w:pPr>
+        <w:ind w:left="1440" w:hanging="360"/>
+      </w:pPr>
+      <w:rPr>
+        <w:rFonts w:ascii="Courier New" w:hAnsi="Courier New" w:cs="Courier New" w:hint="default"/>
+      </w:rPr>
+    </w:lvl>
+    <w:lvl w:ilvl="2" w:tplc="04070005" w:tentative="1">
+      <w:start w:val="1"/>
+      <w:numFmt w:val="bullet"/>
+      <w:lvlText w:val=""/>
+      <w:lvlJc w:val="left"/>
+      <w:pPr>
+        <w:ind w:left="2160" w:hanging="360"/>
+      </w:pPr>
+      <w:rPr>
+        <w:rFonts w:ascii="Wingdings" w:hAnsi="Wingdings" w:hint="default"/>
+      </w:rPr>
+    </w:lvl>
+    <w:lvl w:ilvl="3" w:tplc="04070001" w:tentative="1">
+      <w:start w:val="1"/>
+      <w:numFmt w:val="bullet"/>
+      <w:lvlText w:val=""/>
+      <w:lvlJc w:val="left"/>
+      <w:pPr>
+        <w:ind w:left="2880" w:hanging="360"/>
+      </w:pPr>
+      <w:rPr>
+        <w:rFonts w:ascii="Symbol" w:hAnsi="Symbol" w:hint="default"/>
+      </w:rPr>
+    </w:lvl>
+    <w:lvl w:ilvl="4" w:tplc="04070003" w:tentative="1">
+      <w:start w:val="1"/>
+      <w:numFmt w:val="bullet"/>
+      <w:lvlText w:val="o"/>
+      <w:lvlJc w:val="left"/>
+      <w:pPr>
+        <w:ind w:left="3600" w:hanging="360"/>
+      </w:pPr>
+      <w:rPr>
+        <w:rFonts w:ascii="Courier New" w:hAnsi="Courier New" w:cs="Courier New" w:hint="default"/>
+      </w:rPr>
+    </w:lvl>
+    <w:lvl w:ilvl="5" w:tplc="04070005" w:tentative="1">
+      <w:start w:val="1"/>
+      <w:numFmt w:val="bullet"/>
+      <w:lvlText w:val=""/>
+      <w:lvlJc w:val="left"/>
+      <w:pPr>
+        <w:ind w:left="4320" w:hanging="360"/>
+      </w:pPr>
+      <w:rPr>
+        <w:rFonts w:ascii="Wingdings" w:hAnsi="Wingdings" w:hint="default"/>
+      </w:rPr>
+    </w:lvl>
+    <w:lvl w:ilvl="6" w:tplc="04070001" w:tentative="1">
+      <w:start w:val="1"/>
+      <w:numFmt w:val="bullet"/>
+      <w:lvlText w:val=""/>
+      <w:lvlJc w:val="left"/>
+      <w:pPr>
+        <w:ind w:left="5040" w:hanging="360"/>
+      </w:pPr>
+      <w:rPr>
+        <w:rFonts w:ascii="Symbol" w:hAnsi="Symbol" w:hint="default"/>
+      </w:rPr>
+    </w:lvl>
+    <w:lvl w:ilvl="7" w:tplc="04070003" w:tentative="1">
+      <w:start w:val="1"/>
+      <w:numFmt w:val="bullet"/>
+      <w:lvlText w:val="o"/>
+      <w:lvlJc w:val="left"/>
+      <w:pPr>
+        <w:ind w:left="5760" w:hanging="360"/>
+      </w:pPr>
+      <w:rPr>
+        <w:rFonts w:ascii="Courier New" w:hAnsi="Courier New" w:cs="Courier New" w:hint="default"/>
+      </w:rPr>
+    </w:lvl>
+    <w:lvl w:ilvl="8" w:tplc="04070005" w:tentative="1">
+      <w:start w:val="1"/>
+      <w:numFmt w:val="bullet"/>
+      <w:lvlText w:val=""/>
+      <w:lvlJc w:val="left"/>
+      <w:pPr>
+        <w:ind w:left="6480" w:hanging="360"/>
+      </w:pPr>
+      <w:rPr>
+        <w:rFonts w:ascii="Wingdings" w:hAnsi="Wingdings" w:hint="default"/>
+      </w:rPr>
+    </w:lvl>
+  </w:abstractNum>
+  <w:abstractNum w:abstractNumId="4" w15:restartNumberingAfterBreak="0">
     <w:nsid w:val="4AEC0B1F"/>
     <w:multiLevelType w:val="multilevel"/>
     <w:tmpl w:val="940AD31A"/>
@@ -4411,7 +6938,269 @@
       </w:rPr>
     </w:lvl>
   </w:abstractNum>
-  <w:abstractNum w:abstractNumId="3" w15:restartNumberingAfterBreak="0">
+  <w:abstractNum w:abstractNumId="5" w15:restartNumberingAfterBreak="0">
+    <w:nsid w:val="5F852B0F"/>
+    <w:multiLevelType w:val="multilevel"/>
+    <w:tmpl w:val="2A1A75F0"/>
+    <w:lvl w:ilvl="0">
+      <w:start w:val="1"/>
+      <w:numFmt w:val="bullet"/>
+      <w:lvlText w:val=""/>
+      <w:lvlJc w:val="left"/>
+      <w:pPr>
+        <w:tabs>
+          <w:tab w:val="num" w:pos="720"/>
+        </w:tabs>
+        <w:ind w:left="720" w:hanging="360"/>
+      </w:pPr>
+      <w:rPr>
+        <w:rFonts w:ascii="Symbol" w:hAnsi="Symbol" w:hint="default"/>
+        <w:sz w:val="20"/>
+      </w:rPr>
+    </w:lvl>
+    <w:lvl w:ilvl="1" w:tentative="1">
+      <w:start w:val="1"/>
+      <w:numFmt w:val="bullet"/>
+      <w:lvlText w:val=""/>
+      <w:lvlJc w:val="left"/>
+      <w:pPr>
+        <w:tabs>
+          <w:tab w:val="num" w:pos="1440"/>
+        </w:tabs>
+        <w:ind w:left="1440" w:hanging="360"/>
+      </w:pPr>
+      <w:rPr>
+        <w:rFonts w:ascii="Symbol" w:hAnsi="Symbol" w:hint="default"/>
+        <w:sz w:val="20"/>
+      </w:rPr>
+    </w:lvl>
+    <w:lvl w:ilvl="2" w:tentative="1">
+      <w:start w:val="1"/>
+      <w:numFmt w:val="bullet"/>
+      <w:lvlText w:val=""/>
+      <w:lvlJc w:val="left"/>
+      <w:pPr>
+        <w:tabs>
+          <w:tab w:val="num" w:pos="2160"/>
+        </w:tabs>
+        <w:ind w:left="2160" w:hanging="360"/>
+      </w:pPr>
+      <w:rPr>
+        <w:rFonts w:ascii="Symbol" w:hAnsi="Symbol" w:hint="default"/>
+        <w:sz w:val="20"/>
+      </w:rPr>
+    </w:lvl>
+    <w:lvl w:ilvl="3" w:tentative="1">
+      <w:start w:val="1"/>
+      <w:numFmt w:val="bullet"/>
+      <w:lvlText w:val=""/>
+      <w:lvlJc w:val="left"/>
+      <w:pPr>
+        <w:tabs>
+          <w:tab w:val="num" w:pos="2880"/>
+        </w:tabs>
+        <w:ind w:left="2880" w:hanging="360"/>
+      </w:pPr>
+      <w:rPr>
+        <w:rFonts w:ascii="Symbol" w:hAnsi="Symbol" w:hint="default"/>
+        <w:sz w:val="20"/>
+      </w:rPr>
+    </w:lvl>
+    <w:lvl w:ilvl="4" w:tentative="1">
+      <w:start w:val="1"/>
+      <w:numFmt w:val="bullet"/>
+      <w:lvlText w:val=""/>
+      <w:lvlJc w:val="left"/>
+      <w:pPr>
+        <w:tabs>
+          <w:tab w:val="num" w:pos="3600"/>
+        </w:tabs>
+        <w:ind w:left="3600" w:hanging="360"/>
+      </w:pPr>
+      <w:rPr>
+        <w:rFonts w:ascii="Symbol" w:hAnsi="Symbol" w:hint="default"/>
+        <w:sz w:val="20"/>
+      </w:rPr>
+    </w:lvl>
+    <w:lvl w:ilvl="5" w:tentative="1">
+      <w:start w:val="1"/>
+      <w:numFmt w:val="bullet"/>
+      <w:lvlText w:val=""/>
+      <w:lvlJc w:val="left"/>
+      <w:pPr>
+        <w:tabs>
+          <w:tab w:val="num" w:pos="4320"/>
+        </w:tabs>
+        <w:ind w:left="4320" w:hanging="360"/>
+      </w:pPr>
+      <w:rPr>
+        <w:rFonts w:ascii="Symbol" w:hAnsi="Symbol" w:hint="default"/>
+        <w:sz w:val="20"/>
+      </w:rPr>
+    </w:lvl>
+    <w:lvl w:ilvl="6" w:tentative="1">
+      <w:start w:val="1"/>
+      <w:numFmt w:val="bullet"/>
+      <w:lvlText w:val=""/>
+      <w:lvlJc w:val="left"/>
+      <w:pPr>
+        <w:tabs>
+          <w:tab w:val="num" w:pos="5040"/>
+        </w:tabs>
+        <w:ind w:left="5040" w:hanging="360"/>
+      </w:pPr>
+      <w:rPr>
+        <w:rFonts w:ascii="Symbol" w:hAnsi="Symbol" w:hint="default"/>
+        <w:sz w:val="20"/>
+      </w:rPr>
+    </w:lvl>
+    <w:lvl w:ilvl="7" w:tentative="1">
+      <w:start w:val="1"/>
+      <w:numFmt w:val="bullet"/>
+      <w:lvlText w:val=""/>
+      <w:lvlJc w:val="left"/>
+      <w:pPr>
+        <w:tabs>
+          <w:tab w:val="num" w:pos="5760"/>
+        </w:tabs>
+        <w:ind w:left="5760" w:hanging="360"/>
+      </w:pPr>
+      <w:rPr>
+        <w:rFonts w:ascii="Symbol" w:hAnsi="Symbol" w:hint="default"/>
+        <w:sz w:val="20"/>
+      </w:rPr>
+    </w:lvl>
+    <w:lvl w:ilvl="8" w:tentative="1">
+      <w:start w:val="1"/>
+      <w:numFmt w:val="bullet"/>
+      <w:lvlText w:val=""/>
+      <w:lvlJc w:val="left"/>
+      <w:pPr>
+        <w:tabs>
+          <w:tab w:val="num" w:pos="6480"/>
+        </w:tabs>
+        <w:ind w:left="6480" w:hanging="360"/>
+      </w:pPr>
+      <w:rPr>
+        <w:rFonts w:ascii="Symbol" w:hAnsi="Symbol" w:hint="default"/>
+        <w:sz w:val="20"/>
+      </w:rPr>
+    </w:lvl>
+  </w:abstractNum>
+  <w:abstractNum w:abstractNumId="6" w15:restartNumberingAfterBreak="0">
+    <w:nsid w:val="63E467C7"/>
+    <w:multiLevelType w:val="multilevel"/>
+    <w:tmpl w:val="1E4A5108"/>
+    <w:lvl w:ilvl="0">
+      <w:start w:val="1"/>
+      <w:numFmt w:val="decimal"/>
+      <w:lvlText w:val="%1."/>
+      <w:lvlJc w:val="left"/>
+      <w:pPr>
+        <w:tabs>
+          <w:tab w:val="num" w:pos="720"/>
+        </w:tabs>
+        <w:ind w:left="720" w:hanging="360"/>
+      </w:pPr>
+    </w:lvl>
+    <w:lvl w:ilvl="1" w:tentative="1">
+      <w:start w:val="1"/>
+      <w:numFmt w:val="decimal"/>
+      <w:lvlText w:val="%2."/>
+      <w:lvlJc w:val="left"/>
+      <w:pPr>
+        <w:tabs>
+          <w:tab w:val="num" w:pos="1440"/>
+        </w:tabs>
+        <w:ind w:left="1440" w:hanging="360"/>
+      </w:pPr>
+    </w:lvl>
+    <w:lvl w:ilvl="2" w:tentative="1">
+      <w:start w:val="1"/>
+      <w:numFmt w:val="decimal"/>
+      <w:lvlText w:val="%3."/>
+      <w:lvlJc w:val="left"/>
+      <w:pPr>
+        <w:tabs>
+          <w:tab w:val="num" w:pos="2160"/>
+        </w:tabs>
+        <w:ind w:left="2160" w:hanging="360"/>
+      </w:pPr>
+    </w:lvl>
+    <w:lvl w:ilvl="3" w:tentative="1">
+      <w:start w:val="1"/>
+      <w:numFmt w:val="decimal"/>
+      <w:lvlText w:val="%4."/>
+      <w:lvlJc w:val="left"/>
+      <w:pPr>
+        <w:tabs>
+          <w:tab w:val="num" w:pos="2880"/>
+        </w:tabs>
+        <w:ind w:left="2880" w:hanging="360"/>
+      </w:pPr>
+    </w:lvl>
+    <w:lvl w:ilvl="4" w:tentative="1">
+      <w:start w:val="1"/>
+      <w:numFmt w:val="decimal"/>
+      <w:lvlText w:val="%5."/>
+      <w:lvlJc w:val="left"/>
+      <w:pPr>
+        <w:tabs>
+          <w:tab w:val="num" w:pos="3600"/>
+        </w:tabs>
+        <w:ind w:left="3600" w:hanging="360"/>
+      </w:pPr>
+    </w:lvl>
+    <w:lvl w:ilvl="5" w:tentative="1">
+      <w:start w:val="1"/>
+      <w:numFmt w:val="decimal"/>
+      <w:lvlText w:val="%6."/>
+      <w:lvlJc w:val="left"/>
+      <w:pPr>
+        <w:tabs>
+          <w:tab w:val="num" w:pos="4320"/>
+        </w:tabs>
+        <w:ind w:left="4320" w:hanging="360"/>
+      </w:pPr>
+    </w:lvl>
+    <w:lvl w:ilvl="6" w:tentative="1">
+      <w:start w:val="1"/>
+      <w:numFmt w:val="decimal"/>
+      <w:lvlText w:val="%7."/>
+      <w:lvlJc w:val="left"/>
+      <w:pPr>
+        <w:tabs>
+          <w:tab w:val="num" w:pos="5040"/>
+        </w:tabs>
+        <w:ind w:left="5040" w:hanging="360"/>
+      </w:pPr>
+    </w:lvl>
+    <w:lvl w:ilvl="7" w:tentative="1">
+      <w:start w:val="1"/>
+      <w:numFmt w:val="decimal"/>
+      <w:lvlText w:val="%8."/>
+      <w:lvlJc w:val="left"/>
+      <w:pPr>
+        <w:tabs>
+          <w:tab w:val="num" w:pos="5760"/>
+        </w:tabs>
+        <w:ind w:left="5760" w:hanging="360"/>
+      </w:pPr>
+    </w:lvl>
+    <w:lvl w:ilvl="8" w:tentative="1">
+      <w:start w:val="1"/>
+      <w:numFmt w:val="decimal"/>
+      <w:lvlText w:val="%9."/>
+      <w:lvlJc w:val="left"/>
+      <w:pPr>
+        <w:tabs>
+          <w:tab w:val="num" w:pos="6480"/>
+        </w:tabs>
+        <w:ind w:left="6480" w:hanging="360"/>
+      </w:pPr>
+    </w:lvl>
+  </w:abstractNum>
+  <w:abstractNum w:abstractNumId="7" w15:restartNumberingAfterBreak="0">
     <w:nsid w:val="6461272A"/>
     <w:multiLevelType w:val="multilevel"/>
     <w:tmpl w:val="4A5AB37E"/>
@@ -4524,7 +7313,120 @@
       </w:pPr>
     </w:lvl>
   </w:abstractNum>
-  <w:abstractNum w:abstractNumId="4" w15:restartNumberingAfterBreak="0">
+  <w:abstractNum w:abstractNumId="8" w15:restartNumberingAfterBreak="0">
+    <w:nsid w:val="68930C71"/>
+    <w:multiLevelType w:val="multilevel"/>
+    <w:tmpl w:val="E724F8FC"/>
+    <w:lvl w:ilvl="0">
+      <w:start w:val="1"/>
+      <w:numFmt w:val="decimal"/>
+      <w:lvlText w:val="%1."/>
+      <w:lvlJc w:val="left"/>
+      <w:pPr>
+        <w:tabs>
+          <w:tab w:val="num" w:pos="720"/>
+        </w:tabs>
+        <w:ind w:left="720" w:hanging="360"/>
+      </w:pPr>
+    </w:lvl>
+    <w:lvl w:ilvl="1" w:tentative="1">
+      <w:start w:val="1"/>
+      <w:numFmt w:val="decimal"/>
+      <w:lvlText w:val="%2."/>
+      <w:lvlJc w:val="left"/>
+      <w:pPr>
+        <w:tabs>
+          <w:tab w:val="num" w:pos="1440"/>
+        </w:tabs>
+        <w:ind w:left="1440" w:hanging="360"/>
+      </w:pPr>
+    </w:lvl>
+    <w:lvl w:ilvl="2" w:tentative="1">
+      <w:start w:val="1"/>
+      <w:numFmt w:val="decimal"/>
+      <w:lvlText w:val="%3."/>
+      <w:lvlJc w:val="left"/>
+      <w:pPr>
+        <w:tabs>
+          <w:tab w:val="num" w:pos="2160"/>
+        </w:tabs>
+        <w:ind w:left="2160" w:hanging="360"/>
+      </w:pPr>
+    </w:lvl>
+    <w:lvl w:ilvl="3" w:tentative="1">
+      <w:start w:val="1"/>
+      <w:numFmt w:val="decimal"/>
+      <w:lvlText w:val="%4."/>
+      <w:lvlJc w:val="left"/>
+      <w:pPr>
+        <w:tabs>
+          <w:tab w:val="num" w:pos="2880"/>
+        </w:tabs>
+        <w:ind w:left="2880" w:hanging="360"/>
+      </w:pPr>
+    </w:lvl>
+    <w:lvl w:ilvl="4" w:tentative="1">
+      <w:start w:val="1"/>
+      <w:numFmt w:val="decimal"/>
+      <w:lvlText w:val="%5."/>
+      <w:lvlJc w:val="left"/>
+      <w:pPr>
+        <w:tabs>
+          <w:tab w:val="num" w:pos="3600"/>
+        </w:tabs>
+        <w:ind w:left="3600" w:hanging="360"/>
+      </w:pPr>
+    </w:lvl>
+    <w:lvl w:ilvl="5" w:tentative="1">
+      <w:start w:val="1"/>
+      <w:numFmt w:val="decimal"/>
+      <w:lvlText w:val="%6."/>
+      <w:lvlJc w:val="left"/>
+      <w:pPr>
+        <w:tabs>
+          <w:tab w:val="num" w:pos="4320"/>
+        </w:tabs>
+        <w:ind w:left="4320" w:hanging="360"/>
+      </w:pPr>
+    </w:lvl>
+    <w:lvl w:ilvl="6" w:tentative="1">
+      <w:start w:val="1"/>
+      <w:numFmt w:val="decimal"/>
+      <w:lvlText w:val="%7."/>
+      <w:lvlJc w:val="left"/>
+      <w:pPr>
+        <w:tabs>
+          <w:tab w:val="num" w:pos="5040"/>
+        </w:tabs>
+        <w:ind w:left="5040" w:hanging="360"/>
+      </w:pPr>
+    </w:lvl>
+    <w:lvl w:ilvl="7" w:tentative="1">
+      <w:start w:val="1"/>
+      <w:numFmt w:val="decimal"/>
+      <w:lvlText w:val="%8."/>
+      <w:lvlJc w:val="left"/>
+      <w:pPr>
+        <w:tabs>
+          <w:tab w:val="num" w:pos="5760"/>
+        </w:tabs>
+        <w:ind w:left="5760" w:hanging="360"/>
+      </w:pPr>
+    </w:lvl>
+    <w:lvl w:ilvl="8" w:tentative="1">
+      <w:start w:val="1"/>
+      <w:numFmt w:val="decimal"/>
+      <w:lvlText w:val="%9."/>
+      <w:lvlJc w:val="left"/>
+      <w:pPr>
+        <w:tabs>
+          <w:tab w:val="num" w:pos="6480"/>
+        </w:tabs>
+        <w:ind w:left="6480" w:hanging="360"/>
+      </w:pPr>
+    </w:lvl>
+  </w:abstractNum>
+  <w:abstractNum w:abstractNumId="9" w15:restartNumberingAfterBreak="0">
     <w:nsid w:val="74646936"/>
     <w:multiLevelType w:val="multilevel"/>
     <w:tmpl w:val="2A9864B4"/>
@@ -4642,19 +7544,34 @@
     </w:lvl>
   </w:abstractNum>
   <w:num w:numId="1" w16cid:durableId="1742554699">
+    <w:abstractNumId w:val="9"/>
+  </w:num>
+  <w:num w:numId="2" w16cid:durableId="626282064">
     <w:abstractNumId w:val="4"/>
   </w:num>
-  <w:num w:numId="2" w16cid:durableId="626282064">
+  <w:num w:numId="3" w16cid:durableId="2034453256">
     <w:abstractNumId w:val="2"/>
-  </w:num>
-  <w:num w:numId="3" w16cid:durableId="2034453256">
-    <w:abstractNumId w:val="1"/>
   </w:num>
   <w:num w:numId="4" w16cid:durableId="1745953916">
     <w:abstractNumId w:val="0"/>
   </w:num>
   <w:num w:numId="5" w16cid:durableId="1069889654">
+    <w:abstractNumId w:val="7"/>
+  </w:num>
+  <w:num w:numId="6" w16cid:durableId="400910415">
     <w:abstractNumId w:val="3"/>
+  </w:num>
+  <w:num w:numId="7" w16cid:durableId="419133821">
+    <w:abstractNumId w:val="6"/>
+  </w:num>
+  <w:num w:numId="8" w16cid:durableId="427117861">
+    <w:abstractNumId w:val="1"/>
+  </w:num>
+  <w:num w:numId="9" w16cid:durableId="2021349531">
+    <w:abstractNumId w:val="5"/>
+  </w:num>
+  <w:num w:numId="10" w16cid:durableId="983584103">
+    <w:abstractNumId w:val="8"/>
   </w:num>
 </w:numbering>
 </file>

</xml_diff>